<commit_message>
Simplify Neon Dash journal language and update Word download
</commit_message>
<xml_diff>
--- a/assets/neon-dash/neon-dash-development-journal.docx
+++ b/assets/neon-dash/neon-dash-development-journal.docx
@@ -20,7 +20,7 @@
     </w:p>
     <w:p>
       <w:r>
-        <w:t>My class project was to use WebGPT to create a Geometry Dash style game. The result is NEON DASH, a browser game with five levels, automatic forward movement, jumps and a double jump. This entry documents my request, the current outcome, how the code works, and my goals for the rest of the week.</w:t>
+        <w:t>In class, I asked WebGPT to make a game like Geometry Dash. I wanted a square that jumps over spikes and goes through different levels. The game is called Neon Dash. It has five levels and a double jump.</w:t>
       </w:r>
     </w:p>
     <w:p>
@@ -33,12 +33,12 @@
     </w:p>
     <w:p>
       <w:r>
-        <w:t>I gave WebGPT specific rules: use Space or other buttons to jump, make squares safe to land on, and make spikes end the attempt. I also asked for creative maps, multiple levels, a portal after each level, and background colors that change as the player levels up. My visual direction was to make everything “very cool and intriguing.”</w:t>
+        <w:t>I told WebGPT to use Space or other buttons to jump. I wanted squares that were safe to land on and spikes that would make the player lose. I also asked for creative maps, portals between levels, and background colors that changed with each level. I wanted the game to look cool and be fun to play.</w:t>
       </w:r>
     </w:p>
     <w:p>
       <w:r>
-        <w:t>The current file turns that request into one HTML document containing the interface, styling and game logic. To understand the result, I can follow a key press into the jump variables, then into movement and collision checks. Comparing those checks with my original wording also reveals details that need clearer instructions.</w:t>
+        <w:t>WebGPT put the game in one HTML file. The file has the page layout, colors, and game code. Looking through it helped me understand what happens after a jump button is pressed.</w:t>
       </w:r>
     </w:p>
     <w:p>
@@ -51,7 +51,7 @@
         <w:drawing>
           <wp:inline xmlns:a="http://schemas.openxmlformats.org/drawingml/2006/main" xmlns:pic="http://schemas.openxmlformats.org/drawingml/2006/picture">
             <wp:extent cx="6080760" cy="2850356"/>
-            <wp:docPr id="1" name="Picture 1" descr="Neon Dash start screen with keyboard controls, double jump instructions and a Start button"/>
+            <wp:docPr id="1" name="Picture 1" descr="Neon Dash start screen showing the jump controls and Start button"/>
             <wp:cNvGraphicFramePr>
               <a:graphicFrameLocks noChangeAspect="1"/>
             </wp:cNvGraphicFramePr>
@@ -87,7 +87,7 @@
         <w:pStyle w:val="Caption"/>
       </w:pPr>
       <w:r>
-        <w:t>Figure 1. The current start screen explains jumping, spikes and portals. The literal \u26A1 and \u2014 text is a visible menu issue to fix in a future revision.</w:t>
+        <w:t>Figure 1. The start screen shows the controls. Some symbols appear as strange text, like \u26A1. I want to fix that.</w:t>
       </w:r>
     </w:p>
     <w:p>
@@ -95,25 +95,12 @@
         <w:pStyle w:val="Heading2"/>
       </w:pPr>
       <w:r>
-        <w:t>The current outcome</w:t>
+        <w:t>How it turned out</w:t>
       </w:r>
     </w:p>
     <w:p>
       <w:r>
-        <w:t>The five maps are Stereo Genesis, Azure Drift, Violet Voltage, Crimson Circuit and Emerald Singularity. Their difficulty labels range from EASY to INSANE. The build adds glowing obstacles, a rotating square player, trails and a double jump. A browser check reached the Level 1 portal and continued into Level 2 with a different background. A later spike collision increased ATTEMPTS from 1 to 2 and restarted the current level.</w:t>
-      </w:r>
-    </w:p>
-    <w:p>
-      <w:r>
-        <w:br w:type="page"/>
-      </w:r>
-    </w:p>
-    <w:p>
-      <w:pPr>
-        <w:pStyle w:val="Heading1"/>
-      </w:pPr>
-      <w:r>
-        <w:t>How the game works</w:t>
+        <w:t>The square moves forward on its own, so the player has to time each jump. The game has glowing platforms, spikes, and a portal at the end of each level. A test showed that the Level 1 portal led to Level 2 and the background changed. Hitting a spike added one to the attempt count and restarted the level.</w:t>
       </w:r>
     </w:p>
     <w:p>
@@ -121,30 +108,72 @@
         <w:pStyle w:val="Heading2"/>
       </w:pPr>
       <w:r>
-        <w:t>The canvas</w:t>
+        <w:t>What I learned</w:t>
       </w:r>
     </w:p>
     <w:p>
       <w:r>
-        <w:t>The drawing surface is &lt;canvas id="game"&gt;&lt;/canvas&gt; in the body at line 58. CSS at line 10 fills the browser window. It has no fixed width or height in the HTML: syncSize() reads its displayed size and assigns canvas.width, canvas.height, W and H at lines 78–89. The screenshots use a 1280 × 600 pixel canvas.</w:t>
+        <w:t>I learned that the game has several parts working together. Button presses start jumps, variables remember what is happening, and the game loop keeps everything moving. I also noticed that squares are only safe to land on from above. Hitting their sides still makes the player lose. I need to be more exact when I explain the rules to WebGPT.</w:t>
       </w:r>
     </w:p>
     <w:p>
+      <w:pPr>
+        <w:pStyle w:val="Heading1"/>
+        <w:pageBreakBefore/>
+      </w:pPr>
       <w:r>
-        <w:t>A wider window shows more of the level ahead. A taller one moves the ground because groundY() returns H × 0.78 (line 206). At 600 pixels tall, the ground is y = 468. Obstacle units stay at U = 46 and the player stays about 37.72 pixels wide. Changing the HTML width or height alone will be overwritten by syncSize(); a useful experiment must change the window or the canvas CSS size.</w:t>
+        <w:t>How the code works</w:t>
       </w:r>
     </w:p>
     <w:p>
       <w:pPr>
         <w:pStyle w:val="Heading2"/>
+        <w:spacing w:before="100" w:after="60"/>
+      </w:pPr>
+      <w:r>
+        <w:t>The canvas</w:t>
+      </w:r>
+    </w:p>
+    <w:p>
+      <w:pPr>
+        <w:spacing w:line="240" w:lineRule="auto" w:after="80"/>
+      </w:pPr>
+      <w:r>
+        <w:rPr>
+          <w:sz w:val="21"/>
+        </w:rPr>
+        <w:t>The canvas is the area where the game is drawn. It is &lt;canvas id="game"&gt;&lt;/canvas&gt; at line 58. It fills the browser window. The screenshots use a canvas that is 1280 pixels wide and 600 pixels tall.</w:t>
+      </w:r>
+    </w:p>
+    <w:p>
+      <w:pPr>
+        <w:spacing w:line="240" w:lineRule="auto" w:after="80"/>
+      </w:pPr>
+      <w:r>
+        <w:rPr>
+          <w:sz w:val="21"/>
+        </w:rPr>
+        <w:t>syncSize() matches the canvas to the window at lines 78–89. A wider window shows more of the map. A taller window moves the ground, which is 78 percent of the way down the screen. The blocks stay the same size.</w:t>
+      </w:r>
+    </w:p>
+    <w:p>
+      <w:pPr>
+        <w:pStyle w:val="Heading2"/>
+        <w:spacing w:before="100" w:after="60"/>
       </w:pPr>
       <w:r>
         <w:t>The state variables</w:t>
       </w:r>
     </w:p>
     <w:p>
+      <w:pPr>
+        <w:spacing w:line="240" w:lineRule="auto" w:after="80"/>
+      </w:pPr>
       <w:r>
-        <w:t>State variables remember what is happening between frames. They are declared in the script, mainly under STATE, with input flags under INPUT. Constants such as gravity and jump speed are separate settings at lines 91–98.</w:t>
+        <w:rPr>
+          <w:sz w:val="21"/>
+        </w:rPr>
+        <w:t>Variables help the game remember things like the player’s position and how many tries I have used. Most are declared under STATE. The jump variables are under INPUT.</w:t>
       </w:r>
     </w:p>
     <w:tbl>
@@ -222,7 +251,7 @@
                 <w:b/>
                 <w:sz w:val="18"/>
               </w:rPr>
-              <w:t>What it stores</w:t>
+              <w:t>What it remembers</w:t>
             </w:r>
           </w:p>
         </w:tc>
@@ -254,7 +283,7 @@
                 <w:b/>
                 <w:sz w:val="18"/>
               </w:rPr>
-              <w:t>Source lines</w:t>
+              <w:t>Code lines</w:t>
             </w:r>
           </w:p>
         </w:tc>
@@ -420,7 +449,7 @@
                 <w:b w:val="0"/>
                 <w:sz w:val="18"/>
               </w:rPr>
-              <w:t>Current level and cumulative attempt count</w:t>
+              <w:t>The level and how many tries I have used</w:t>
             </w:r>
           </w:p>
         </w:tc>
@@ -618,7 +647,7 @@
                 <w:b w:val="0"/>
                 <w:sz w:val="18"/>
               </w:rPr>
-              <w:t>Canvas dimensions and camera position</w:t>
+              <w:t>Screen size and where the camera is</w:t>
             </w:r>
           </w:p>
         </w:tc>
@@ -717,7 +746,7 @@
                 <w:b w:val="0"/>
                 <w:sz w:val="18"/>
               </w:rPr>
-              <w:t>Held input and a fresh jump request</w:t>
+              <w:t>Whether I am holding or pressing jump</w:t>
             </w:r>
           </w:p>
         </w:tc>
@@ -816,7 +845,7 @@
                 <w:b w:val="0"/>
                 <w:sz w:val="18"/>
               </w:rPr>
-              <w:t>Retry and level transition timing</w:t>
+              <w:t>Waiting time before a retry or next level</w:t>
             </w:r>
           </w:p>
         </w:tc>
@@ -915,7 +944,7 @@
                 <w:b w:val="0"/>
                 <w:sz w:val="18"/>
               </w:rPr>
-              <w:t>Animation effects rather than points</w:t>
+              <w:t>The glowing effects behind the player</w:t>
             </w:r>
           </w:p>
         </w:tc>
@@ -955,15 +984,33 @@
     </w:tbl>
     <w:p>
       <w:pPr>
+        <w:spacing w:line="240" w:lineRule="auto" w:after="80"/>
+      </w:pPr>
+      <w:r>
+        <w:rPr>
+          <w:sz w:val="21"/>
+        </w:rPr>
+        <w:t>player remembers its position (x, y), up or down speed (vy), rotation (rot), whether it has landed (onGround), and extra jumps (airJumps). Speed uses BASE_SPEED and the level’s speed setting (line 207).</w:t>
+      </w:r>
+    </w:p>
+    <w:p>
+      <w:pPr>
         <w:pStyle w:val="Heading2"/>
+        <w:spacing w:before="100" w:after="60"/>
       </w:pPr>
       <w:r>
         <w:t>The game loop</w:t>
       </w:r>
     </w:p>
     <w:p>
+      <w:pPr>
+        <w:spacing w:line="240" w:lineRule="auto" w:after="80"/>
+      </w:pPr>
       <w:r>
-        <w:t>loop(now), at lines 561–574, repeats through requestAnimationFrame(loop). The browser schedules it around screen refresh, often near 60 frames per second, rather than at a guaranteed fixed rate. Each frame updates the game through update(dt) and draws it through draw(). dt measures elapsed time in units of about 16.67 milliseconds and is capped at 2.5 to limit large movement steps.</w:t>
+        <w:rPr>
+          <w:sz w:val="21"/>
+        </w:rPr>
+        <w:t>loop(now) repeats using requestAnimationFrame(loop) at lines 561–574, often about 60 times a second. update(dt) moves things and checks the rules. draw() draws the new picture. dt helps adjust for the time between frames.</w:t>
       </w:r>
     </w:p>
     <w:p>
@@ -972,8 +1019,6 @@
         <w:shd w:fill="F2F4F6"/>
       </w:pPr>
       <w:r>
-        <w:t>const dt = Math.min(2.5, (now - last) / 16.67);</w:t>
-        <w:br/>
         <w:t>if(state !== 'menu' &amp;&amp; state !== 'win') update(dt);</w:t>
         <w:br/>
         <w:t>try { draw(); } catch(e) {}</w:t>
@@ -984,27 +1029,111 @@
     <w:p>
       <w:pPr>
         <w:pStyle w:val="Heading2"/>
+        <w:spacing w:before="100" w:after="60"/>
       </w:pPr>
       <w:r>
         <w:t>Input handling</w:t>
       </w:r>
     </w:p>
     <w:p>
+      <w:pPr>
+        <w:spacing w:line="240" w:lineRule="auto" w:after="80"/>
+      </w:pPr>
       <w:r>
-        <w:t>The keydown listener accepts Space, ArrowUp and W (lines 233–239). Mouse and touch events also jump. pressJump() sets jumpHeld and queues a fresh press. The next update sets player.vy to JUMP_V = −13.4 for a ground jump. A fresh airborne press sets vy to DJUMP_V = −12.2 and spends the one airJumps charge (lines 328–350). Releasing and pressing again is necessary for the double jump; holding a button automatically jumps after landing. Landing on the ground or a block refills the charge.</w:t>
+        <w:rPr>
+          <w:sz w:val="21"/>
+        </w:rPr>
+        <w:t>Space, Up, W, clicking, or tapping makes the player jump. The keyboard listener is at lines 233–239. pressJump() changes jumpHeld and jumpQueued. update() changes player.vy to move the square upward. Letting go and pressing again in the air uses the double jump. Landing gives it back. Holding jump makes the square jump again after landing.</w:t>
       </w:r>
     </w:p>
     <w:p>
+      <w:pPr>
+        <w:pStyle w:val="Heading2"/>
+        <w:spacing w:before="100" w:after="60"/>
+      </w:pPr>
       <w:r>
-        <w:br w:type="page"/>
+        <w:t>Collision and win or lose logic</w:t>
+      </w:r>
+    </w:p>
+    <w:p>
+      <w:pPr>
+        <w:spacing w:line="240" w:lineRule="auto" w:after="80"/>
+      </w:pPr>
+      <w:r>
+        <w:rPr>
+          <w:sz w:val="21"/>
+        </w:rPr>
+        <w:t>A hitbox is an invisible shape used to check whether things are touching. rectsOverlap(a,b) checks whether two rectangular hitboxes overlap (line 258):</w:t>
+      </w:r>
+    </w:p>
+    <w:p>
+      <w:pPr>
+        <w:pStyle w:val="Codeexcerpt"/>
+        <w:shd w:fill="F2F4F6"/>
+      </w:pPr>
+      <w:r>
+        <w:t>a.x &lt; b.x+b.w &amp;&amp; a.x+a.w &gt; b.x &amp;&amp;</w:t>
+        <w:br/>
+        <w:t>a.y &lt; b.y+b.h &amp;&amp; a.y+a.h &gt; b.y</w:t>
+      </w:r>
+    </w:p>
+    <w:p>
+      <w:pPr>
+        <w:spacing w:line="240" w:lineRule="auto" w:after="80"/>
+      </w:pPr>
+      <w:r>
+        <w:rPr>
+          <w:sz w:val="21"/>
+        </w:rPr>
+        <w:t>Touching a spike runs die() (line 364). The level restarts after a short wait (lines 303–305). A block is safe when falling onto its top. The check is player.vy &gt;= 0 &amp;&amp; prevBottom &lt;= oy + 14 (line 368). Hitting its side makes the player lose.</w:t>
+      </w:r>
+    </w:p>
+    <w:p>
+      <w:pPr>
+        <w:spacing w:line="240" w:lineRule="auto" w:after="80"/>
+      </w:pPr>
+      <w:r>
+        <w:rPr>
+          <w:sz w:val="21"/>
+        </w:rPr>
+        <w:t>Reaching the portal’s horizontal position runs completeLevel() (line 383). The next level starts after a short wait. Finishing all five levels shows YOU WIN! (lines 308–315).</w:t>
+      </w:r>
+    </w:p>
+    <w:p>
+      <w:pPr>
+        <w:pStyle w:val="Heading2"/>
+        <w:spacing w:before="100" w:after="60"/>
+      </w:pPr>
+      <w:r>
+        <w:t>Scoring and progress</w:t>
+      </w:r>
+    </w:p>
+    <w:p>
+      <w:pPr>
+        <w:spacing w:line="240" w:lineRule="auto" w:after="80"/>
+      </w:pPr>
+      <w:r>
+        <w:rPr>
+          <w:sz w:val="21"/>
+        </w:rPr>
+        <w:t>There is no points score. attempts starts at 1, and attempts++ adds one when the player crashes (line 262). The progress bar shows how far the square has gone through the level. Lines 380–381 divide player.x by levelEndX() and change the bar’s width.</w:t>
+      </w:r>
+    </w:p>
+    <w:p>
+      <w:pPr>
+        <w:pStyle w:val="Caption"/>
+      </w:pPr>
+      <w:r>
+        <w:t>Code reference: neon-dash-v4-doublejump.html. The line numbers match the supplied 578-line file.</w:t>
       </w:r>
     </w:p>
     <w:p>
       <w:pPr>
         <w:pStyle w:val="Heading1"/>
+        <w:pageBreakBefore/>
       </w:pPr>
       <w:r>
-        <w:t>Screenshots and game rules</w:t>
+        <w:t>Screenshots and goals</w:t>
       </w:r>
     </w:p>
     <w:p>
@@ -1017,7 +1146,7 @@
         <w:drawing>
           <wp:inline xmlns:a="http://schemas.openxmlformats.org/drawingml/2006/main" xmlns:pic="http://schemas.openxmlformats.org/drawingml/2006/picture">
             <wp:extent cx="5715000" cy="2678906"/>
-            <wp:docPr id="2" name="Picture 2" descr="Level 1 player in the air with a trail and a shockwave ring from the double jump above a spike"/>
+            <wp:docPr id="2" name="Picture 2" descr="The player double jumps above a spike in Level 1"/>
             <wp:cNvGraphicFramePr>
               <a:graphicFrameLocks noChangeAspect="1"/>
             </wp:cNvGraphicFramePr>
@@ -1053,7 +1182,7 @@
         <w:pStyle w:val="Caption"/>
       </w:pPr>
       <w:r>
-        <w:t>Figure 2. A fresh second press activates the double jump. The ring below the player is its visual feedback.</w:t>
+        <w:t>Figure 2. The square is doing a double jump. The ring underneath it shows that the extra jump was used.</w:t>
       </w:r>
     </w:p>
     <w:p>
@@ -1066,7 +1195,7 @@
         <w:drawing>
           <wp:inline xmlns:a="http://schemas.openxmlformats.org/drawingml/2006/main" xmlns:pic="http://schemas.openxmlformats.org/drawingml/2006/picture">
             <wp:extent cx="2834640" cy="1328738"/>
-            <wp:docPr id="3" name="Picture 3" descr="The player approaches the portal near the end of Level 1"/>
+            <wp:docPr id="3" name="Picture 3" descr="The portal near the end of Level 1"/>
             <wp:cNvGraphicFramePr>
               <a:graphicFrameLocks noChangeAspect="1"/>
             </wp:cNvGraphicFramePr>
@@ -1103,7 +1232,7 @@
         <w:drawing>
           <wp:inline xmlns:a="http://schemas.openxmlformats.org/drawingml/2006/main" xmlns:pic="http://schemas.openxmlformats.org/drawingml/2006/picture">
             <wp:extent cx="2834640" cy="1328738"/>
-            <wp:docPr id="4" name="Picture 4" descr="Level 2 Azure Drift begins with a purple background and progress reset"/>
+            <wp:docPr id="4" name="Picture 4" descr="Level 2 with a different background color"/>
             <wp:cNvGraphicFramePr>
               <a:graphicFrameLocks noChangeAspect="1"/>
             </wp:cNvGraphicFramePr>
@@ -1139,7 +1268,7 @@
         <w:pStyle w:val="Caption"/>
       </w:pPr>
       <w:r>
-        <w:t>Figures 3 and 4. Left: the portal near the end of Stereo Genesis. Right: Azure Drift after the transition, with its new background and a fresh progress bar. These are screenshots from the current build.</w:t>
+        <w:t>Figure 3 shows the portal at the end of Level 1. Figure 4 shows the new background in Level 2.</w:t>
       </w:r>
     </w:p>
     <w:p>
@@ -1147,33 +1276,7 @@
         <w:pStyle w:val="Heading2"/>
       </w:pPr>
       <w:r>
-        <w:t>Collision and win or lose logic</w:t>
-      </w:r>
-    </w:p>
-    <w:p>
-      <w:r>
-        <w:t>rectsOverlap(a,b), at line 258, checks whether two rectangles overlap on both axes. The actual comparison is:</w:t>
-      </w:r>
-    </w:p>
-    <w:p>
-      <w:pPr>
-        <w:pStyle w:val="Codeexcerpt"/>
-        <w:shd w:fill="F2F4F6"/>
-      </w:pPr>
-      <w:r>
-        <w:t>a.x &lt; b.x+b.w &amp;&amp; a.x+a.w &gt; b.x &amp;&amp;</w:t>
-        <w:br/>
-        <w:t>a.y &lt; b.y+b.h &amp;&amp; a.y+a.h &gt; b.y</w:t>
-      </w:r>
-    </w:p>
-    <w:p>
-      <w:r>
-        <w:t>A spike uses a smaller rectangular hitbox inside its drawn triangle. If rectsOverlap(pb, sb) is true, die() runs (lines 357–364). A square is safe only when the player is falling onto its top: player.vy &gt;= 0 &amp;&amp; prevBottom &lt;= oy + 14. Otherwise, touching the block ends the attempt (lines 367–371). Death sets state to dead; after deadTimer &gt; 55, the same level restarts.</w:t>
-      </w:r>
-    </w:p>
-    <w:p>
-      <w:r>
-        <w:t>The portal finishes a level when player.x + PLAYER &gt; portalX &amp;&amp; player.x &lt; portalX + U*1.5 (line 383). This is a horizontal position test. After the transition timer, the next level starts; completing the final level sets state to win and shows YOU WIN! (lines 308–315).</w:t>
+        <w:t>My goals for October 14 to October 18</w:t>
       </w:r>
     </w:p>
     <w:p>
@@ -1181,25 +1284,12 @@
         <w:pStyle w:val="Heading2"/>
       </w:pPr>
       <w:r>
-        <w:t>Scoring and progress</w:t>
+        <w:t>Test the double jump by October 14</w:t>
       </w:r>
     </w:p>
     <w:p>
       <w:r>
-        <w:t>There is no points score variable. attempts starts at 1 (line 199), and attempts++ updates the displayed count in die() (line 262). Progress is calculated with Math.min(1, player.x / levelEndX()) and written to progressBar.style.width as a percentage (lines 380–381). Attempts measure retries; the bar measures distance through the current map.</w:t>
-      </w:r>
-    </w:p>
-    <w:p>
-      <w:r>
-        <w:br w:type="page"/>
-      </w:r>
-    </w:p>
-    <w:p>
-      <w:pPr>
-        <w:pStyle w:val="Heading1"/>
-      </w:pPr>
-      <w:r>
-        <w:t>What I understand and what comes next</w:t>
+        <w:t>I will test jumping ten times. I will check the first jump, the double jump, and what happens if I try a third jump. I will also check that landing gives the extra jump back. This will help me understand the jump variables.</w:t>
       </w:r>
     </w:p>
     <w:p>
@@ -1207,22 +1297,12 @@
         <w:pStyle w:val="Heading2"/>
       </w:pPr>
       <w:r>
-        <w:t>My reflection</w:t>
+        <w:t>Fix the instructions by October 16</w:t>
       </w:r>
     </w:p>
     <w:p>
       <w:r>
-        <w:t>My prompt defined the experience I wanted, but the code determines the exact rules. The clearest example is “squares are safe to land on.” The implementation allows landing from above, while a side collision still ends the attempt. That is a useful distinction to explain to a player and to check when giving WebGPT the next request.</w:t>
-      </w:r>
-    </w:p>
-    <w:p>
-      <w:r>
-        <w:t>I now understand how input, state and the loop connect. A key press changes flags, update() turns those flags into velocity, gravity changes the motion, and collision checks decide whether the player lands or dies. draw() displays the result. The double jump depends on remembering whether an extra jump is available, so the game needs more than a picture of the player.</w:t>
-      </w:r>
-    </w:p>
-    <w:p>
-      <w:r>
-        <w:t>The background change is also controlled by state. startLevel() sets bgHueTarget to the new map’s hue, and update() gradually moves bgHue toward that target (lines 217 and 292). The visual effect is part of the level transition, while the obstacle layouts and speed multipliers define the difficulty.</w:t>
+        <w:t>I will make a copy of the game and fix the strange symbols on the start screen. I will also explain that squares are only safe when landing on top. I will save a screenshot to show the changes.</w:t>
       </w:r>
     </w:p>
     <w:p>
@@ -1230,7 +1310,12 @@
         <w:pStyle w:val="Heading2"/>
       </w:pPr>
       <w:r>
-        <w:t>Goals for October 14 to October 18</w:t>
+        <w:t>Check the levels by October 18</w:t>
+      </w:r>
+    </w:p>
+    <w:p>
+      <w:r>
+        <w:t>I will try each level five times and record my attempts and farthest progress. I can use a practice copy to start harder levels. If a section feels too hard, I will change the spacing and try it five more times to see if it feels better.</w:t>
       </w:r>
     </w:p>
     <w:p>
@@ -1238,59 +1323,12 @@
         <w:pStyle w:val="Heading2"/>
       </w:pPr>
       <w:r>
-        <w:t>Trace and test the double jump by Wednesday October 14</w:t>
+        <w:t>Try two window sizes by October 18</w:t>
       </w:r>
     </w:p>
     <w:p>
       <w:r>
-        <w:t>I will document the sequence from keydown to jumpQueued, player.vy and airJumps. I will run ten short trials covering a ground jump, a fresh second press, an attempted third jump, and a landing. Success means I can explain why only one extra jump is allowed before landing and show that the charge refills. This goal follows directly from the fresh press rule I found in the input code.</w:t>
-      </w:r>
-    </w:p>
-    <w:p>
-      <w:pPr>
-        <w:pStyle w:val="Heading2"/>
-      </w:pPr>
-      <w:r>
-        <w:t>Clarify the rules and repair menu text by Friday October 16</w:t>
-      </w:r>
-    </w:p>
-    <w:p>
-      <w:r>
-        <w:t>In a separate working copy, I will change the instructions to say that landing on top of squares is safe and side collisions are dangerous. I will replace the visible \u26A1 and \u2014 strings in the HTML with proper characters or HTML entities. Success means a new start screen screenshot has readable symbols and instructions that match the collision logic.</w:t>
-      </w:r>
-    </w:p>
-    <w:p>
-      <w:pPr>
-        <w:pStyle w:val="Heading2"/>
-      </w:pPr>
-      <w:r>
-        <w:t>Check map difficulty by Sunday October 18</w:t>
-      </w:r>
-    </w:p>
-    <w:p>
-      <w:r>
-        <w:t>I will record attempts and farthest progress for five runs of each map, using a practice copy to start harder levels directly if needed. I will identify one obstacle sequence where the timing feels unfair, adjust its spacing, and compare five more runs. Success means I have a before and after record and can explain the change using the map’s speed and jump range. This will help evaluate my request for creative maps rather than judging only their appearance.</w:t>
-      </w:r>
-    </w:p>
-    <w:p>
-      <w:pPr>
-        <w:pStyle w:val="Heading2"/>
-      </w:pPr>
-      <w:r>
-        <w:t>Test the canvas at two sizes by Sunday October 18</w:t>
-      </w:r>
-    </w:p>
-    <w:p>
-      <w:r>
-        <w:t>I will compare an 800 × 600 window with a 1280 × 720 window and save screenshots of the same level. I will check the controls, HUD and visible obstacles, and compare the ground positions of 468 and 561.6 pixels. Success means I can explain what resizing changes and identify any layout problem that affects play. This follows from the canvas sizing code rather than guessing that the whole game scales equally.</w:t>
-      </w:r>
-    </w:p>
-    <w:p>
-      <w:pPr>
-        <w:pStyle w:val="Caption"/>
-      </w:pPr>
-      <w:r>
-        <w:t>Code reference: neon-dash-v4-doublejump.html. All source line numbers refer to the supplied 578-line version.</w:t>
+        <w:t>I will try the game at 800 × 600 and 1280 × 720. I will take screenshots of the same level and compare the ground, controls, and how much of the map I can see. This will help me understand how the canvas size affects the game.</w:t>
       </w:r>
     </w:p>
     <w:sectPr>

</xml_diff>

<commit_message>
Rename journal project to Geometry Dash My Version
</commit_message>
<xml_diff>
--- a/assets/neon-dash/neon-dash-development-journal.docx
+++ b/assets/neon-dash/neon-dash-development-journal.docx
@@ -7,7 +7,7 @@
         <w:pStyle w:val="Title"/>
       </w:pPr>
       <w:r>
-        <w:t>Neon Dash Development Journal</w:t>
+        <w:t>Geometry Dash My Version</w:t>
       </w:r>
     </w:p>
     <w:p>
@@ -20,7 +20,7 @@
     </w:p>
     <w:p>
       <w:r>
-        <w:t>In class, I asked WebGPT to make a game like Geometry Dash. I wanted a square that jumps over spikes and goes through different levels. The game is called Neon Dash. It has five levels and a double jump.</w:t>
+        <w:t>In class, I asked WebGPT to make a game like Geometry Dash. I wanted a square that jumps over spikes and goes through different levels. My game is called Geometry Dash My Version. It has five levels and a double jump.</w:t>
       </w:r>
     </w:p>
     <w:p>
@@ -51,7 +51,7 @@
         <w:drawing>
           <wp:inline xmlns:a="http://schemas.openxmlformats.org/drawingml/2006/main" xmlns:pic="http://schemas.openxmlformats.org/drawingml/2006/picture">
             <wp:extent cx="6080760" cy="2850356"/>
-            <wp:docPr id="1" name="Picture 1" descr="Neon Dash start screen showing the jump controls and Start button"/>
+            <wp:docPr id="1" name="Picture 1" descr="Game start screen showing the jump controls and Start button"/>
             <wp:cNvGraphicFramePr>
               <a:graphicFrameLocks noChangeAspect="1"/>
             </wp:cNvGraphicFramePr>

</xml_diff>

<commit_message>
Shorten Geometry Dash journal and use geometry-dash-game permalink
</commit_message>
<xml_diff>
--- a/assets/neon-dash/neon-dash-development-journal.docx
+++ b/assets/neon-dash/neon-dash-development-journal.docx
@@ -15,12 +15,54 @@
         <w:pStyle w:val="Subtitle"/>
       </w:pPr>
       <w:r>
-        <w:t>Innovators Journal entry    |    October 13 2026</w:t>
+        <w:t>Innovators Journal  |  October 13, 2026  |  Updated October 15, 2026</w:t>
       </w:r>
     </w:p>
     <w:p>
+      <w:r/>
+      <w:hyperlink r:id="rId9">
+        <w:r>
+          <w:rPr>
+            <w:rStyle w:val="Hyperlink"/>
+          </w:rPr>
+          <w:t>Play the five-level game</w:t>
+        </w:r>
+      </w:hyperlink>
       <w:r>
-        <w:t>In class, I asked WebGPT to make a game like Geometry Dash. I wanted a square that jumps over spikes and goes through different levels. My game is called Geometry Dash My Version. It has five levels and a double jump.</w:t>
+        <w:t xml:space="preserve"> · </w:t>
+      </w:r>
+      <w:hyperlink r:id="rId10">
+        <w:r>
+          <w:rPr>
+            <w:rStyle w:val="Hyperlink"/>
+          </w:rPr>
+          <w:t>Download the Word journal</w:t>
+        </w:r>
+      </w:hyperlink>
+      <w:r>
+        <w:t xml:space="preserve"> · </w:t>
+      </w:r>
+      <w:hyperlink r:id="rId11">
+        <w:r>
+          <w:rPr>
+            <w:rStyle w:val="Hyperlink"/>
+          </w:rPr>
+          <w:t>View the source</w:t>
+        </w:r>
+      </w:hyperlink>
+      <w:r/>
+    </w:p>
+    <w:p>
+      <w:r>
+        <w:t>In class, I used WebGPT to make a game like Geometry Dash. I chose the features and gave feedback while WebGPT generated the code. The linked game and screenshots show the five-level version. Later versions from my WebGPT chat add more features.</w:t>
+      </w:r>
+    </w:p>
+    <w:p>
+      <w:pPr>
+        <w:pStyle w:val="Heading1"/>
+      </w:pPr>
+      <w:r>
+        <w:t>My development process</w:t>
       </w:r>
     </w:p>
     <w:p>
@@ -28,17 +70,43 @@
         <w:pStyle w:val="Heading2"/>
       </w:pPr>
       <w:r>
-        <w:t>My process</w:t>
+        <w:t>October 12</w:t>
       </w:r>
     </w:p>
     <w:p>
       <w:r>
-        <w:t>I told WebGPT to use Space or other buttons to jump. I wanted squares that were safe to land on and spikes that would make the player lose. I also asked for creative maps, portals between levels, and background colors that changed with each level. I wanted the game to look cool and be fun to play.</w:t>
+        <w:t>I started with jumping, spikes, safe platforms, levels, and portals. The first game showed a black screen, so I reported it and WebGPT added canvas size checks. Level 1 was too hard, so I asked for an easier start and harder later levels. The base speed dropped from 7.2 to 6.0. I then requested a double jump and comments to help explain the code. Landing restores the extra jump.</w:t>
+      </w:r>
+    </w:p>
+    <w:p>
+      <w:pPr>
+        <w:pStyle w:val="Heading2"/>
+      </w:pPr>
+      <w:r>
+        <w:t>October 14</w:t>
       </w:r>
     </w:p>
     <w:p>
       <w:r>
-        <w:t>WebGPT put the game in one HTML file. The file has the page layout, colors, and game code. Looking through it helped me understand what happens after a jump button is pressed.</w:t>
+        <w:t>I asked for menus, Dash-Lite and Dash-Extreme with 50 levels each, English, Spanish, Chinese, and a tutorial. WebGPT returned an expanded version with generated levels and saved progress. Another revision added wave movement: a blue portal changes the cube into an arrow, holding makes it rise, releasing makes it fall, and a yellow portal finishes the level. My last request was to make Extreme much harder; the chat ends before a reply. These later versions still need testing.</w:t>
+      </w:r>
+    </w:p>
+    <w:p>
+      <w:pPr>
+        <w:pStyle w:val="Heading1"/>
+      </w:pPr>
+      <w:r>
+        <w:t>What I learned</w:t>
+      </w:r>
+    </w:p>
+    <w:p>
+      <w:r>
+        <w:t>HTML provides the canvas and buttons, CSS controls their appearance, and JavaScript handles movement and rules. Variables remember things like the extra jump, while hitboxes check collisions. A square is safe to land on from above, but hitting its side makes the player lose. The expanded version also introduced repeatable level generation, translated text, and saved settings.</w:t>
+      </w:r>
+    </w:p>
+    <w:p>
+      <w:r>
+        <w:t>Next time, I would test one short level before adding more features. I would describe what I expected, what happened, and how to repeat a problem. Saving versions, screenshots, and test results would help me track changes and understand the code better.</w:t>
       </w:r>
     </w:p>
     <w:p>
@@ -50,8 +118,8 @@
       <w:r>
         <w:drawing>
           <wp:inline xmlns:a="http://schemas.openxmlformats.org/drawingml/2006/main" xmlns:pic="http://schemas.openxmlformats.org/drawingml/2006/picture">
-            <wp:extent cx="6080760" cy="2850356"/>
-            <wp:docPr id="1" name="Picture 1" descr="Game start screen showing the jump controls and Start button"/>
+            <wp:extent cx="4754880" cy="2228850"/>
+            <wp:docPr id="1" name="Picture 1" descr="Game start screen with jump controls"/>
             <wp:cNvGraphicFramePr>
               <a:graphicFrameLocks noChangeAspect="1"/>
             </wp:cNvGraphicFramePr>
@@ -63,7 +131,7 @@
                     <pic:cNvPicPr/>
                   </pic:nvPicPr>
                   <pic:blipFill>
-                    <a:blip r:embed="rId9"/>
+                    <a:blip r:embed="rId12"/>
                     <a:stretch>
                       <a:fillRect/>
                     </a:stretch>
@@ -71,7 +139,7 @@
                   <pic:spPr>
                     <a:xfrm>
                       <a:off x="0" y="0"/>
-                      <a:ext cx="6080760" cy="2850356"/>
+                      <a:ext cx="4754880" cy="2228850"/>
                     </a:xfrm>
                     <a:prstGeom prst="rect"/>
                   </pic:spPr>
@@ -87,33 +155,7 @@
         <w:pStyle w:val="Caption"/>
       </w:pPr>
       <w:r>
-        <w:t>Figure 1. The start screen shows the controls. Some symbols appear as strange text, like \u26A1. I want to fix that.</w:t>
-      </w:r>
-    </w:p>
-    <w:p>
-      <w:pPr>
-        <w:pStyle w:val="Heading2"/>
-      </w:pPr>
-      <w:r>
-        <w:t>How it turned out</w:t>
-      </w:r>
-    </w:p>
-    <w:p>
-      <w:r>
-        <w:t>The square moves forward on its own, so the player has to time each jump. The game has glowing platforms, spikes, and a portal at the end of each level. A test showed that the Level 1 portal led to Level 2 and the background changed. Hitting a spike added one to the attempt count and restarted the level.</w:t>
-      </w:r>
-    </w:p>
-    <w:p>
-      <w:pPr>
-        <w:pStyle w:val="Heading2"/>
-      </w:pPr>
-      <w:r>
-        <w:t>What I learned</w:t>
-      </w:r>
-    </w:p>
-    <w:p>
-      <w:r>
-        <w:t>I learned that the game has several parts working together. Button presses start jumps, variables remember what is happening, and the game loop keeps everything moving. I also noticed that squares are only safe to land on from above. Hitting their sides still makes the player lose. I need to be more exact when I explain the rules to WebGPT.</w:t>
+        <w:t>The five-level game's start screen. Some symbols still display as strange text.</w:t>
       </w:r>
     </w:p>
     <w:p>
@@ -122,64 +164,56 @@
         <w:pageBreakBefore/>
       </w:pPr>
       <w:r>
-        <w:t>How the code works</w:t>
+        <w:t>How the published game works</w:t>
       </w:r>
     </w:p>
     <w:p>
       <w:pPr>
         <w:pStyle w:val="Heading2"/>
-        <w:spacing w:before="100" w:after="60"/>
       </w:pPr>
       <w:r>
         <w:t>The canvas</w:t>
       </w:r>
     </w:p>
     <w:p>
-      <w:pPr>
-        <w:spacing w:line="240" w:lineRule="auto" w:after="80"/>
-      </w:pPr>
+      <w:r/>
       <w:r>
         <w:rPr>
-          <w:sz w:val="21"/>
+          <w:rFonts w:ascii="Consolas" w:hAnsi="Consolas"/>
+          <w:sz w:val="19"/>
         </w:rPr>
-        <w:t>The canvas is the area where the game is drawn. It is &lt;canvas id="game"&gt;&lt;/canvas&gt; at line 58. It fills the browser window. The screenshots use a canvas that is 1280 pixels wide and 600 pixels tall.</w:t>
+        <w:t>&lt;canvas id="game"&gt;&lt;/canvas&gt;</w:t>
       </w:r>
-    </w:p>
-    <w:p>
-      <w:pPr>
-        <w:spacing w:line="240" w:lineRule="auto" w:after="80"/>
-      </w:pPr>
+      <w:r>
+        <w:t xml:space="preserve"> is at line 58. </w:t>
+      </w:r>
       <w:r>
         <w:rPr>
-          <w:sz w:val="21"/>
+          <w:rFonts w:ascii="Consolas" w:hAnsi="Consolas"/>
+          <w:sz w:val="19"/>
         </w:rPr>
-        <w:t>syncSize() matches the canvas to the window at lines 78–89. A wider window shows more of the map. A taller window moves the ground, which is 78 percent of the way down the screen. The blocks stay the same size.</w:t>
+        <w:t>syncSize()</w:t>
+      </w:r>
+      <w:r>
+        <w:t xml:space="preserve"> matches it to the browser window (lines 78–89). These screenshots use 1280 × 600 pixels. A wider window shows more of the map; a taller one moves the ground. Blocks stay the same size.</w:t>
       </w:r>
     </w:p>
     <w:p>
       <w:pPr>
         <w:pStyle w:val="Heading2"/>
-        <w:spacing w:before="100" w:after="60"/>
       </w:pPr>
       <w:r>
         <w:t>The state variables</w:t>
       </w:r>
     </w:p>
     <w:p>
-      <w:pPr>
-        <w:spacing w:line="240" w:lineRule="auto" w:after="80"/>
-      </w:pPr>
       <w:r>
-        <w:rPr>
-          <w:sz w:val="21"/>
-        </w:rPr>
-        <w:t>Variables help the game remember things like the player’s position and how many tries I have used. Most are declared under STATE. The jump variables are under INPUT.</w:t>
+        <w:t>Most variables are declared under STATE; jump controls are under INPUT.</w:t>
       </w:r>
     </w:p>
     <w:tbl>
       <w:tblPr>
         <w:tblW w:type="auto" w:w="0"/>
-        <w:jc w:val="center"/>
         <w:tblLayout w:type="fixed"/>
         <w:tblLook w:firstColumn="1" w:firstRow="1" w:lastColumn="0" w:lastRow="0" w:noHBand="0" w:noVBand="1" w:val="04A0"/>
       </w:tblPr>
@@ -195,14 +229,14 @@
         </w:trPr>
         <w:tc>
           <w:tcPr>
-            <w:tcW w:type="dxa" w:w="2736"/>
+            <w:tcW w:type="dxa" w:w="2808"/>
             <w:vAlign w:val="center"/>
             <w:shd w:fill="DCE6EF"/>
             <w:tcMar>
-              <w:top w:w="75" w:type="dxa"/>
-              <w:left w:w="75" w:type="dxa"/>
-              <w:bottom w:w="75" w:type="dxa"/>
-              <w:right w:w="75" w:type="dxa"/>
+              <w:top w:w="70" w:type="dxa"/>
+              <w:left w:w="70" w:type="dxa"/>
+              <w:bottom w:w="70" w:type="dxa"/>
+              <w:right w:w="70" w:type="dxa"/>
             </w:tcMar>
             <w:tcBorders>
               <w:top w:val="single" w:sz="4" w:color="D9D9D9"/>
@@ -226,14 +260,14 @@
         </w:tc>
         <w:tc>
           <w:tcPr>
-            <w:tcW w:type="dxa" w:w="5256"/>
+            <w:tcW w:type="dxa" w:w="5400"/>
             <w:vAlign w:val="center"/>
             <w:shd w:fill="DCE6EF"/>
             <w:tcMar>
-              <w:top w:w="75" w:type="dxa"/>
-              <w:left w:w="75" w:type="dxa"/>
-              <w:bottom w:w="75" w:type="dxa"/>
-              <w:right w:w="75" w:type="dxa"/>
+              <w:top w:w="70" w:type="dxa"/>
+              <w:left w:w="70" w:type="dxa"/>
+              <w:bottom w:w="70" w:type="dxa"/>
+              <w:right w:w="70" w:type="dxa"/>
             </w:tcMar>
             <w:tcBorders>
               <w:top w:val="single" w:sz="4" w:color="D9D9D9"/>
@@ -257,14 +291,14 @@
         </w:tc>
         <w:tc>
           <w:tcPr>
-            <w:tcW w:type="dxa" w:w="2088"/>
+            <w:tcW w:type="dxa" w:w="1872"/>
             <w:vAlign w:val="center"/>
             <w:shd w:fill="DCE6EF"/>
             <w:tcMar>
-              <w:top w:w="75" w:type="dxa"/>
-              <w:left w:w="75" w:type="dxa"/>
-              <w:bottom w:w="75" w:type="dxa"/>
-              <w:right w:w="75" w:type="dxa"/>
+              <w:top w:w="70" w:type="dxa"/>
+              <w:left w:w="70" w:type="dxa"/>
+              <w:bottom w:w="70" w:type="dxa"/>
+              <w:right w:w="70" w:type="dxa"/>
             </w:tcMar>
             <w:tcBorders>
               <w:top w:val="single" w:sz="4" w:color="D9D9D9"/>
@@ -276,7 +310,6 @@
           <w:p>
             <w:pPr>
               <w:spacing w:after="0" w:line="240" w:lineRule="auto"/>
-              <w:jc w:val="center"/>
             </w:pPr>
             <w:r>
               <w:rPr>
@@ -294,14 +327,14 @@
         </w:trPr>
         <w:tc>
           <w:tcPr>
-            <w:tcW w:type="dxa" w:w="2736"/>
+            <w:tcW w:type="dxa" w:w="2808"/>
             <w:vAlign w:val="center"/>
             <w:shd w:fill="FFFFFF"/>
             <w:tcMar>
-              <w:top w:w="75" w:type="dxa"/>
-              <w:left w:w="75" w:type="dxa"/>
-              <w:bottom w:w="75" w:type="dxa"/>
-              <w:right w:w="75" w:type="dxa"/>
+              <w:top w:w="70" w:type="dxa"/>
+              <w:left w:w="70" w:type="dxa"/>
+              <w:bottom w:w="70" w:type="dxa"/>
+              <w:right w:w="70" w:type="dxa"/>
             </w:tcMar>
             <w:tcBorders>
               <w:top w:val="single" w:sz="4" w:color="D9D9D9"/>
@@ -319,20 +352,63 @@
                 <w:b w:val="0"/>
                 <w:sz w:val="18"/>
               </w:rPr>
+            </w:r>
+            <w:r>
+              <w:rPr>
+                <w:rFonts w:ascii="Consolas" w:hAnsi="Consolas"/>
+                <w:b w:val="0"/>
+                <w:sz w:val="18"/>
+              </w:rPr>
               <w:t>state</w:t>
+            </w:r>
+            <w:r>
+              <w:rPr>
+                <w:b w:val="0"/>
+                <w:sz w:val="18"/>
+              </w:rPr>
+              <w:t xml:space="preserve">, </w:t>
+            </w:r>
+            <w:r>
+              <w:rPr>
+                <w:rFonts w:ascii="Consolas" w:hAnsi="Consolas"/>
+                <w:b w:val="0"/>
+                <w:sz w:val="18"/>
+              </w:rPr>
+              <w:t>levelIdx</w:t>
+            </w:r>
+            <w:r>
+              <w:rPr>
+                <w:b w:val="0"/>
+                <w:sz w:val="18"/>
+              </w:rPr>
+              <w:t xml:space="preserve">, </w:t>
+            </w:r>
+            <w:r>
+              <w:rPr>
+                <w:rFonts w:ascii="Consolas" w:hAnsi="Consolas"/>
+                <w:b w:val="0"/>
+                <w:sz w:val="18"/>
+              </w:rPr>
+              <w:t>attempts</w:t>
+            </w:r>
+            <w:r>
+              <w:rPr>
+                <w:b w:val="0"/>
+                <w:sz w:val="18"/>
+              </w:rPr>
             </w:r>
           </w:p>
         </w:tc>
         <w:tc>
           <w:tcPr>
-            <w:tcW w:type="dxa" w:w="5256"/>
+            <w:tcW w:type="dxa" w:w="5400"/>
             <w:vAlign w:val="center"/>
             <w:shd w:fill="FFFFFF"/>
             <w:tcMar>
-              <w:top w:w="75" w:type="dxa"/>
-              <w:left w:w="75" w:type="dxa"/>
-              <w:bottom w:w="75" w:type="dxa"/>
-              <w:right w:w="75" w:type="dxa"/>
+              <w:top w:w="70" w:type="dxa"/>
+              <w:left w:w="70" w:type="dxa"/>
+              <w:bottom w:w="70" w:type="dxa"/>
+              <w:right w:w="70" w:type="dxa"/>
             </w:tcMar>
             <w:tcBorders>
               <w:top w:val="single" w:sz="4" w:color="D9D9D9"/>
@@ -350,57 +426,20 @@
                 <w:b w:val="0"/>
                 <w:sz w:val="18"/>
               </w:rPr>
-              <w:t>menu, play, dead, levelcomplete or win</w:t>
+              <w:t>Game status, level, and tries</w:t>
             </w:r>
           </w:p>
         </w:tc>
         <w:tc>
           <w:tcPr>
-            <w:tcW w:type="dxa" w:w="2088"/>
+            <w:tcW w:type="dxa" w:w="1872"/>
             <w:vAlign w:val="center"/>
             <w:shd w:fill="FFFFFF"/>
             <w:tcMar>
-              <w:top w:w="75" w:type="dxa"/>
-              <w:left w:w="75" w:type="dxa"/>
-              <w:bottom w:w="75" w:type="dxa"/>
-              <w:right w:w="75" w:type="dxa"/>
-            </w:tcMar>
-            <w:tcBorders>
-              <w:top w:val="single" w:sz="4" w:color="D9D9D9"/>
-              <w:left w:val="single" w:sz="4" w:color="D9D9D9"/>
-              <w:bottom w:val="single" w:sz="4" w:color="D9D9D9"/>
-              <w:right w:val="single" w:sz="4" w:color="D9D9D9"/>
-            </w:tcBorders>
-          </w:tcPr>
-          <w:p>
-            <w:pPr>
-              <w:spacing w:after="0" w:line="240" w:lineRule="auto"/>
-              <w:jc w:val="center"/>
-            </w:pPr>
-            <w:r>
-              <w:rPr>
-                <w:b w:val="0"/>
-                <w:sz w:val="18"/>
-              </w:rPr>
-              <w:t>198; 261; 271; 313</w:t>
-            </w:r>
-          </w:p>
-        </w:tc>
-      </w:tr>
-      <w:tr>
-        <w:trPr>
-          <w:cantSplit/>
-        </w:trPr>
-        <w:tc>
-          <w:tcPr>
-            <w:tcW w:type="dxa" w:w="2736"/>
-            <w:vAlign w:val="center"/>
-            <w:shd w:fill="F6F8FA"/>
-            <w:tcMar>
-              <w:top w:w="75" w:type="dxa"/>
-              <w:left w:w="75" w:type="dxa"/>
-              <w:bottom w:w="75" w:type="dxa"/>
-              <w:right w:w="75" w:type="dxa"/>
+              <w:top w:w="70" w:type="dxa"/>
+              <w:left w:w="70" w:type="dxa"/>
+              <w:bottom w:w="70" w:type="dxa"/>
+              <w:right w:w="70" w:type="dxa"/>
             </w:tcMar>
             <w:tcBorders>
               <w:top w:val="single" w:sz="4" w:color="D9D9D9"/>
@@ -418,20 +457,25 @@
                 <w:b w:val="0"/>
                 <w:sz w:val="18"/>
               </w:rPr>
-              <w:t>levelIdx and attempts</w:t>
+              <w:t>198–200</w:t>
             </w:r>
           </w:p>
         </w:tc>
+      </w:tr>
+      <w:tr>
+        <w:trPr>
+          <w:cantSplit/>
+        </w:trPr>
         <w:tc>
           <w:tcPr>
-            <w:tcW w:type="dxa" w:w="5256"/>
+            <w:tcW w:type="dxa" w:w="2808"/>
             <w:vAlign w:val="center"/>
-            <w:shd w:fill="F6F8FA"/>
+            <w:shd w:fill="F7F9FA"/>
             <w:tcMar>
-              <w:top w:w="75" w:type="dxa"/>
-              <w:left w:w="75" w:type="dxa"/>
-              <w:bottom w:w="75" w:type="dxa"/>
-              <w:right w:w="75" w:type="dxa"/>
+              <w:top w:w="70" w:type="dxa"/>
+              <w:left w:w="70" w:type="dxa"/>
+              <w:bottom w:w="70" w:type="dxa"/>
+              <w:right w:w="70" w:type="dxa"/>
             </w:tcMar>
             <w:tcBorders>
               <w:top w:val="single" w:sz="4" w:color="D9D9D9"/>
@@ -449,57 +493,33 @@
                 <w:b w:val="0"/>
                 <w:sz w:val="18"/>
               </w:rPr>
-              <w:t>The level and how many tries I have used</w:t>
+            </w:r>
+            <w:r>
+              <w:rPr>
+                <w:rFonts w:ascii="Consolas" w:hAnsi="Consolas"/>
+                <w:b w:val="0"/>
+                <w:sz w:val="18"/>
+              </w:rPr>
+              <w:t>player</w:t>
+            </w:r>
+            <w:r>
+              <w:rPr>
+                <w:b w:val="0"/>
+                <w:sz w:val="18"/>
+              </w:rPr>
             </w:r>
           </w:p>
         </w:tc>
         <w:tc>
           <w:tcPr>
-            <w:tcW w:type="dxa" w:w="2088"/>
+            <w:tcW w:type="dxa" w:w="5400"/>
             <w:vAlign w:val="center"/>
-            <w:shd w:fill="F6F8FA"/>
+            <w:shd w:fill="F7F9FA"/>
             <w:tcMar>
-              <w:top w:w="75" w:type="dxa"/>
-              <w:left w:w="75" w:type="dxa"/>
-              <w:bottom w:w="75" w:type="dxa"/>
-              <w:right w:w="75" w:type="dxa"/>
-            </w:tcMar>
-            <w:tcBorders>
-              <w:top w:val="single" w:sz="4" w:color="D9D9D9"/>
-              <w:left w:val="single" w:sz="4" w:color="D9D9D9"/>
-              <w:bottom w:val="single" w:sz="4" w:color="D9D9D9"/>
-              <w:right w:val="single" w:sz="4" w:color="D9D9D9"/>
-            </w:tcBorders>
-          </w:tcPr>
-          <w:p>
-            <w:pPr>
-              <w:spacing w:after="0" w:line="240" w:lineRule="auto"/>
-              <w:jc w:val="center"/>
-            </w:pPr>
-            <w:r>
-              <w:rPr>
-                <w:b w:val="0"/>
-                <w:sz w:val="18"/>
-              </w:rPr>
-              <w:t>199</w:t>
-            </w:r>
-          </w:p>
-        </w:tc>
-      </w:tr>
-      <w:tr>
-        <w:trPr>
-          <w:cantSplit/>
-        </w:trPr>
-        <w:tc>
-          <w:tcPr>
-            <w:tcW w:type="dxa" w:w="2736"/>
-            <w:vAlign w:val="center"/>
-            <w:shd w:fill="FFFFFF"/>
-            <w:tcMar>
-              <w:top w:w="75" w:type="dxa"/>
-              <w:left w:w="75" w:type="dxa"/>
-              <w:bottom w:w="75" w:type="dxa"/>
-              <w:right w:w="75" w:type="dxa"/>
+              <w:top w:w="70" w:type="dxa"/>
+              <w:left w:w="70" w:type="dxa"/>
+              <w:bottom w:w="70" w:type="dxa"/>
+              <w:right w:w="70" w:type="dxa"/>
             </w:tcMar>
             <w:tcBorders>
               <w:top w:val="single" w:sz="4" w:color="D9D9D9"/>
@@ -517,20 +537,50 @@
                 <w:b w:val="0"/>
                 <w:sz w:val="18"/>
               </w:rPr>
-              <w:t>player</w:t>
+              <w:t xml:space="preserve">Position </w:t>
+            </w:r>
+            <w:r>
+              <w:rPr>
+                <w:rFonts w:ascii="Consolas" w:hAnsi="Consolas"/>
+                <w:b w:val="0"/>
+                <w:sz w:val="18"/>
+              </w:rPr>
+              <w:t>x, y</w:t>
+            </w:r>
+            <w:r>
+              <w:rPr>
+                <w:b w:val="0"/>
+                <w:sz w:val="18"/>
+              </w:rPr>
+              <w:t xml:space="preserve">, vertical speed </w:t>
+            </w:r>
+            <w:r>
+              <w:rPr>
+                <w:rFonts w:ascii="Consolas" w:hAnsi="Consolas"/>
+                <w:b w:val="0"/>
+                <w:sz w:val="18"/>
+              </w:rPr>
+              <w:t>vy</w:t>
+            </w:r>
+            <w:r>
+              <w:rPr>
+                <w:b w:val="0"/>
+                <w:sz w:val="18"/>
+              </w:rPr>
+              <w:t>, rotation, landing, and extra jumps</w:t>
             </w:r>
           </w:p>
         </w:tc>
         <w:tc>
           <w:tcPr>
-            <w:tcW w:type="dxa" w:w="5256"/>
+            <w:tcW w:type="dxa" w:w="1872"/>
             <w:vAlign w:val="center"/>
-            <w:shd w:fill="FFFFFF"/>
+            <w:shd w:fill="F7F9FA"/>
             <w:tcMar>
-              <w:top w:w="75" w:type="dxa"/>
-              <w:left w:w="75" w:type="dxa"/>
-              <w:bottom w:w="75" w:type="dxa"/>
-              <w:right w:w="75" w:type="dxa"/>
+              <w:top w:w="70" w:type="dxa"/>
+              <w:left w:w="70" w:type="dxa"/>
+              <w:bottom w:w="70" w:type="dxa"/>
+              <w:right w:w="70" w:type="dxa"/>
             </w:tcMar>
             <w:tcBorders>
               <w:top w:val="single" w:sz="4" w:color="D9D9D9"/>
@@ -548,38 +598,6 @@
                 <w:b w:val="0"/>
                 <w:sz w:val="18"/>
               </w:rPr>
-              <w:t>x, y, vy, rot, onGround and airJumps</w:t>
-            </w:r>
-          </w:p>
-        </w:tc>
-        <w:tc>
-          <w:tcPr>
-            <w:tcW w:type="dxa" w:w="2088"/>
-            <w:vAlign w:val="center"/>
-            <w:shd w:fill="FFFFFF"/>
-            <w:tcMar>
-              <w:top w:w="75" w:type="dxa"/>
-              <w:left w:w="75" w:type="dxa"/>
-              <w:bottom w:w="75" w:type="dxa"/>
-              <w:right w:w="75" w:type="dxa"/>
-            </w:tcMar>
-            <w:tcBorders>
-              <w:top w:val="single" w:sz="4" w:color="D9D9D9"/>
-              <w:left w:val="single" w:sz="4" w:color="D9D9D9"/>
-              <w:bottom w:val="single" w:sz="4" w:color="D9D9D9"/>
-              <w:right w:val="single" w:sz="4" w:color="D9D9D9"/>
-            </w:tcBorders>
-          </w:tcPr>
-          <w:p>
-            <w:pPr>
-              <w:spacing w:after="0" w:line="240" w:lineRule="auto"/>
-              <w:jc w:val="center"/>
-            </w:pPr>
-            <w:r>
-              <w:rPr>
-                <w:b w:val="0"/>
-                <w:sz w:val="18"/>
-              </w:rPr>
               <w:t>212</w:t>
             </w:r>
           </w:p>
@@ -591,14 +609,14 @@
         </w:trPr>
         <w:tc>
           <w:tcPr>
-            <w:tcW w:type="dxa" w:w="2736"/>
+            <w:tcW w:type="dxa" w:w="2808"/>
             <w:vAlign w:val="center"/>
-            <w:shd w:fill="F6F8FA"/>
+            <w:shd w:fill="FFFFFF"/>
             <w:tcMar>
-              <w:top w:w="75" w:type="dxa"/>
-              <w:left w:w="75" w:type="dxa"/>
-              <w:bottom w:w="75" w:type="dxa"/>
-              <w:right w:w="75" w:type="dxa"/>
+              <w:top w:w="70" w:type="dxa"/>
+              <w:left w:w="70" w:type="dxa"/>
+              <w:bottom w:w="70" w:type="dxa"/>
+              <w:right w:w="70" w:type="dxa"/>
             </w:tcMar>
             <w:tcBorders>
               <w:top w:val="single" w:sz="4" w:color="D9D9D9"/>
@@ -616,20 +634,63 @@
                 <w:b w:val="0"/>
                 <w:sz w:val="18"/>
               </w:rPr>
-              <w:t>W, H and camX</w:t>
+            </w:r>
+            <w:r>
+              <w:rPr>
+                <w:rFonts w:ascii="Consolas" w:hAnsi="Consolas"/>
+                <w:b w:val="0"/>
+                <w:sz w:val="18"/>
+              </w:rPr>
+              <w:t>W</w:t>
+            </w:r>
+            <w:r>
+              <w:rPr>
+                <w:b w:val="0"/>
+                <w:sz w:val="18"/>
+              </w:rPr>
+              <w:t xml:space="preserve">, </w:t>
+            </w:r>
+            <w:r>
+              <w:rPr>
+                <w:rFonts w:ascii="Consolas" w:hAnsi="Consolas"/>
+                <w:b w:val="0"/>
+                <w:sz w:val="18"/>
+              </w:rPr>
+              <w:t>H</w:t>
+            </w:r>
+            <w:r>
+              <w:rPr>
+                <w:b w:val="0"/>
+                <w:sz w:val="18"/>
+              </w:rPr>
+              <w:t xml:space="preserve">, </w:t>
+            </w:r>
+            <w:r>
+              <w:rPr>
+                <w:rFonts w:ascii="Consolas" w:hAnsi="Consolas"/>
+                <w:b w:val="0"/>
+                <w:sz w:val="18"/>
+              </w:rPr>
+              <w:t>camX</w:t>
+            </w:r>
+            <w:r>
+              <w:rPr>
+                <w:b w:val="0"/>
+                <w:sz w:val="18"/>
+              </w:rPr>
             </w:r>
           </w:p>
         </w:tc>
         <w:tc>
           <w:tcPr>
-            <w:tcW w:type="dxa" w:w="5256"/>
+            <w:tcW w:type="dxa" w:w="5400"/>
             <w:vAlign w:val="center"/>
-            <w:shd w:fill="F6F8FA"/>
+            <w:shd w:fill="FFFFFF"/>
             <w:tcMar>
-              <w:top w:w="75" w:type="dxa"/>
-              <w:left w:w="75" w:type="dxa"/>
-              <w:bottom w:w="75" w:type="dxa"/>
-              <w:right w:w="75" w:type="dxa"/>
+              <w:top w:w="70" w:type="dxa"/>
+              <w:left w:w="70" w:type="dxa"/>
+              <w:bottom w:w="70" w:type="dxa"/>
+              <w:right w:w="70" w:type="dxa"/>
             </w:tcMar>
             <w:tcBorders>
               <w:top w:val="single" w:sz="4" w:color="D9D9D9"/>
@@ -647,20 +708,20 @@
                 <w:b w:val="0"/>
                 <w:sz w:val="18"/>
               </w:rPr>
-              <w:t>Screen size and where the camera is</w:t>
+              <w:t>Canvas size and camera position</w:t>
             </w:r>
           </w:p>
         </w:tc>
         <w:tc>
           <w:tcPr>
-            <w:tcW w:type="dxa" w:w="2088"/>
+            <w:tcW w:type="dxa" w:w="1872"/>
             <w:vAlign w:val="center"/>
-            <w:shd w:fill="F6F8FA"/>
+            <w:shd w:fill="FFFFFF"/>
             <w:tcMar>
-              <w:top w:w="75" w:type="dxa"/>
-              <w:left w:w="75" w:type="dxa"/>
-              <w:bottom w:w="75" w:type="dxa"/>
-              <w:right w:w="75" w:type="dxa"/>
+              <w:top w:w="70" w:type="dxa"/>
+              <w:left w:w="70" w:type="dxa"/>
+              <w:bottom w:w="70" w:type="dxa"/>
+              <w:right w:w="70" w:type="dxa"/>
             </w:tcMar>
             <w:tcBorders>
               <w:top w:val="single" w:sz="4" w:color="D9D9D9"/>
@@ -672,7 +733,6 @@
           <w:p>
             <w:pPr>
               <w:spacing w:after="0" w:line="240" w:lineRule="auto"/>
-              <w:jc w:val="center"/>
             </w:pPr>
             <w:r>
               <w:rPr>
@@ -690,14 +750,14 @@
         </w:trPr>
         <w:tc>
           <w:tcPr>
-            <w:tcW w:type="dxa" w:w="2736"/>
+            <w:tcW w:type="dxa" w:w="2808"/>
             <w:vAlign w:val="center"/>
-            <w:shd w:fill="FFFFFF"/>
+            <w:shd w:fill="F7F9FA"/>
             <w:tcMar>
-              <w:top w:w="75" w:type="dxa"/>
-              <w:left w:w="75" w:type="dxa"/>
-              <w:bottom w:w="75" w:type="dxa"/>
-              <w:right w:w="75" w:type="dxa"/>
+              <w:top w:w="70" w:type="dxa"/>
+              <w:left w:w="70" w:type="dxa"/>
+              <w:bottom w:w="70" w:type="dxa"/>
+              <w:right w:w="70" w:type="dxa"/>
             </w:tcMar>
             <w:tcBorders>
               <w:top w:val="single" w:sz="4" w:color="D9D9D9"/>
@@ -715,20 +775,48 @@
                 <w:b w:val="0"/>
                 <w:sz w:val="18"/>
               </w:rPr>
-              <w:t>jumpHeld and jumpQueued</w:t>
+            </w:r>
+            <w:r>
+              <w:rPr>
+                <w:rFonts w:ascii="Consolas" w:hAnsi="Consolas"/>
+                <w:b w:val="0"/>
+                <w:sz w:val="18"/>
+              </w:rPr>
+              <w:t>jumpHeld</w:t>
+            </w:r>
+            <w:r>
+              <w:rPr>
+                <w:b w:val="0"/>
+                <w:sz w:val="18"/>
+              </w:rPr>
+              <w:t xml:space="preserve">, </w:t>
+            </w:r>
+            <w:r>
+              <w:rPr>
+                <w:rFonts w:ascii="Consolas" w:hAnsi="Consolas"/>
+                <w:b w:val="0"/>
+                <w:sz w:val="18"/>
+              </w:rPr>
+              <w:t>jumpQueued</w:t>
+            </w:r>
+            <w:r>
+              <w:rPr>
+                <w:b w:val="0"/>
+                <w:sz w:val="18"/>
+              </w:rPr>
             </w:r>
           </w:p>
         </w:tc>
         <w:tc>
           <w:tcPr>
-            <w:tcW w:type="dxa" w:w="5256"/>
+            <w:tcW w:type="dxa" w:w="5400"/>
             <w:vAlign w:val="center"/>
-            <w:shd w:fill="FFFFFF"/>
+            <w:shd w:fill="F7F9FA"/>
             <w:tcMar>
-              <w:top w:w="75" w:type="dxa"/>
-              <w:left w:w="75" w:type="dxa"/>
-              <w:bottom w:w="75" w:type="dxa"/>
-              <w:right w:w="75" w:type="dxa"/>
+              <w:top w:w="70" w:type="dxa"/>
+              <w:left w:w="70" w:type="dxa"/>
+              <w:bottom w:w="70" w:type="dxa"/>
+              <w:right w:w="70" w:type="dxa"/>
             </w:tcMar>
             <w:tcBorders>
               <w:top w:val="single" w:sz="4" w:color="D9D9D9"/>
@@ -746,57 +834,20 @@
                 <w:b w:val="0"/>
                 <w:sz w:val="18"/>
               </w:rPr>
-              <w:t>Whether I am holding or pressing jump</w:t>
+              <w:t>Holding jump or making a new press</w:t>
             </w:r>
           </w:p>
         </w:tc>
         <w:tc>
           <w:tcPr>
-            <w:tcW w:type="dxa" w:w="2088"/>
+            <w:tcW w:type="dxa" w:w="1872"/>
             <w:vAlign w:val="center"/>
-            <w:shd w:fill="FFFFFF"/>
+            <w:shd w:fill="F7F9FA"/>
             <w:tcMar>
-              <w:top w:w="75" w:type="dxa"/>
-              <w:left w:w="75" w:type="dxa"/>
-              <w:bottom w:w="75" w:type="dxa"/>
-              <w:right w:w="75" w:type="dxa"/>
-            </w:tcMar>
-            <w:tcBorders>
-              <w:top w:val="single" w:sz="4" w:color="D9D9D9"/>
-              <w:left w:val="single" w:sz="4" w:color="D9D9D9"/>
-              <w:bottom w:val="single" w:sz="4" w:color="D9D9D9"/>
-              <w:right w:val="single" w:sz="4" w:color="D9D9D9"/>
-            </w:tcBorders>
-          </w:tcPr>
-          <w:p>
-            <w:pPr>
-              <w:spacing w:after="0" w:line="240" w:lineRule="auto"/>
-              <w:jc w:val="center"/>
-            </w:pPr>
-            <w:r>
-              <w:rPr>
-                <w:b w:val="0"/>
-                <w:sz w:val="18"/>
-              </w:rPr>
-              <w:t>230</w:t>
-            </w:r>
-          </w:p>
-        </w:tc>
-      </w:tr>
-      <w:tr>
-        <w:trPr>
-          <w:cantSplit/>
-        </w:trPr>
-        <w:tc>
-          <w:tcPr>
-            <w:tcW w:type="dxa" w:w="2736"/>
-            <w:vAlign w:val="center"/>
-            <w:shd w:fill="F6F8FA"/>
-            <w:tcMar>
-              <w:top w:w="75" w:type="dxa"/>
-              <w:left w:w="75" w:type="dxa"/>
-              <w:bottom w:w="75" w:type="dxa"/>
-              <w:right w:w="75" w:type="dxa"/>
+              <w:top w:w="70" w:type="dxa"/>
+              <w:left w:w="70" w:type="dxa"/>
+              <w:bottom w:w="70" w:type="dxa"/>
+              <w:right w:w="70" w:type="dxa"/>
             </w:tcMar>
             <w:tcBorders>
               <w:top w:val="single" w:sz="4" w:color="D9D9D9"/>
@@ -814,209 +865,91 @@
                 <w:b w:val="0"/>
                 <w:sz w:val="18"/>
               </w:rPr>
-              <w:t>deadTimer and warpTimer</w:t>
-            </w:r>
-          </w:p>
-        </w:tc>
-        <w:tc>
-          <w:tcPr>
-            <w:tcW w:type="dxa" w:w="5256"/>
-            <w:vAlign w:val="center"/>
-            <w:shd w:fill="F6F8FA"/>
-            <w:tcMar>
-              <w:top w:w="75" w:type="dxa"/>
-              <w:left w:w="75" w:type="dxa"/>
-              <w:bottom w:w="75" w:type="dxa"/>
-              <w:right w:w="75" w:type="dxa"/>
-            </w:tcMar>
-            <w:tcBorders>
-              <w:top w:val="single" w:sz="4" w:color="D9D9D9"/>
-              <w:left w:val="single" w:sz="4" w:color="D9D9D9"/>
-              <w:bottom w:val="single" w:sz="4" w:color="D9D9D9"/>
-              <w:right w:val="single" w:sz="4" w:color="D9D9D9"/>
-            </w:tcBorders>
-          </w:tcPr>
-          <w:p>
-            <w:pPr>
-              <w:spacing w:after="0" w:line="240" w:lineRule="auto"/>
-            </w:pPr>
-            <w:r>
-              <w:rPr>
-                <w:b w:val="0"/>
-                <w:sz w:val="18"/>
-              </w:rPr>
-              <w:t>Waiting time before a retry or next level</w:t>
-            </w:r>
-          </w:p>
-        </w:tc>
-        <w:tc>
-          <w:tcPr>
-            <w:tcW w:type="dxa" w:w="2088"/>
-            <w:vAlign w:val="center"/>
-            <w:shd w:fill="F6F8FA"/>
-            <w:tcMar>
-              <w:top w:w="75" w:type="dxa"/>
-              <w:left w:w="75" w:type="dxa"/>
-              <w:bottom w:w="75" w:type="dxa"/>
-              <w:right w:w="75" w:type="dxa"/>
-            </w:tcMar>
-            <w:tcBorders>
-              <w:top w:val="single" w:sz="4" w:color="D9D9D9"/>
-              <w:left w:val="single" w:sz="4" w:color="D9D9D9"/>
-              <w:bottom w:val="single" w:sz="4" w:color="D9D9D9"/>
-              <w:right w:val="single" w:sz="4" w:color="D9D9D9"/>
-            </w:tcBorders>
-          </w:tcPr>
-          <w:p>
-            <w:pPr>
-              <w:spacing w:after="0" w:line="240" w:lineRule="auto"/>
-              <w:jc w:val="center"/>
-            </w:pPr>
-            <w:r>
-              <w:rPr>
-                <w:b w:val="0"/>
-                <w:sz w:val="18"/>
-              </w:rPr>
-              <w:t>202</w:t>
-            </w:r>
-          </w:p>
-        </w:tc>
-      </w:tr>
-      <w:tr>
-        <w:trPr>
-          <w:cantSplit/>
-        </w:trPr>
-        <w:tc>
-          <w:tcPr>
-            <w:tcW w:type="dxa" w:w="2736"/>
-            <w:vAlign w:val="center"/>
-            <w:shd w:fill="FFFFFF"/>
-            <w:tcMar>
-              <w:top w:w="75" w:type="dxa"/>
-              <w:left w:w="75" w:type="dxa"/>
-              <w:bottom w:w="75" w:type="dxa"/>
-              <w:right w:w="75" w:type="dxa"/>
-            </w:tcMar>
-            <w:tcBorders>
-              <w:top w:val="single" w:sz="4" w:color="D9D9D9"/>
-              <w:left w:val="single" w:sz="4" w:color="D9D9D9"/>
-              <w:bottom w:val="single" w:sz="4" w:color="D9D9D9"/>
-              <w:right w:val="single" w:sz="4" w:color="D9D9D9"/>
-            </w:tcBorders>
-          </w:tcPr>
-          <w:p>
-            <w:pPr>
-              <w:spacing w:after="0" w:line="240" w:lineRule="auto"/>
-            </w:pPr>
-            <w:r>
-              <w:rPr>
-                <w:b w:val="0"/>
-                <w:sz w:val="18"/>
-              </w:rPr>
-              <w:t>particles, rings and trail</w:t>
-            </w:r>
-          </w:p>
-        </w:tc>
-        <w:tc>
-          <w:tcPr>
-            <w:tcW w:type="dxa" w:w="5256"/>
-            <w:vAlign w:val="center"/>
-            <w:shd w:fill="FFFFFF"/>
-            <w:tcMar>
-              <w:top w:w="75" w:type="dxa"/>
-              <w:left w:w="75" w:type="dxa"/>
-              <w:bottom w:w="75" w:type="dxa"/>
-              <w:right w:w="75" w:type="dxa"/>
-            </w:tcMar>
-            <w:tcBorders>
-              <w:top w:val="single" w:sz="4" w:color="D9D9D9"/>
-              <w:left w:val="single" w:sz="4" w:color="D9D9D9"/>
-              <w:bottom w:val="single" w:sz="4" w:color="D9D9D9"/>
-              <w:right w:val="single" w:sz="4" w:color="D9D9D9"/>
-            </w:tcBorders>
-          </w:tcPr>
-          <w:p>
-            <w:pPr>
-              <w:spacing w:after="0" w:line="240" w:lineRule="auto"/>
-            </w:pPr>
-            <w:r>
-              <w:rPr>
-                <w:b w:val="0"/>
-                <w:sz w:val="18"/>
-              </w:rPr>
-              <w:t>The glowing effects behind the player</w:t>
-            </w:r>
-          </w:p>
-        </w:tc>
-        <w:tc>
-          <w:tcPr>
-            <w:tcW w:type="dxa" w:w="2088"/>
-            <w:vAlign w:val="center"/>
-            <w:shd w:fill="FFFFFF"/>
-            <w:tcMar>
-              <w:top w:w="75" w:type="dxa"/>
-              <w:left w:w="75" w:type="dxa"/>
-              <w:bottom w:w="75" w:type="dxa"/>
-              <w:right w:w="75" w:type="dxa"/>
-            </w:tcMar>
-            <w:tcBorders>
-              <w:top w:val="single" w:sz="4" w:color="D9D9D9"/>
-              <w:left w:val="single" w:sz="4" w:color="D9D9D9"/>
-              <w:bottom w:val="single" w:sz="4" w:color="D9D9D9"/>
-              <w:right w:val="single" w:sz="4" w:color="D9D9D9"/>
-            </w:tcBorders>
-          </w:tcPr>
-          <w:p>
-            <w:pPr>
-              <w:spacing w:after="0" w:line="240" w:lineRule="auto"/>
-              <w:jc w:val="center"/>
-            </w:pPr>
-            <w:r>
-              <w:rPr>
-                <w:b w:val="0"/>
-                <w:sz w:val="18"/>
-              </w:rPr>
-              <w:t>200</w:t>
+              <w:t>230</w:t>
             </w:r>
           </w:p>
         </w:tc>
       </w:tr>
     </w:tbl>
     <w:p>
-      <w:pPr>
-        <w:spacing w:line="240" w:lineRule="auto" w:after="80"/>
-      </w:pPr>
+      <w:r>
+        <w:t xml:space="preserve">Forward speed uses </w:t>
+      </w:r>
       <w:r>
         <w:rPr>
-          <w:sz w:val="21"/>
+          <w:rFonts w:ascii="Consolas" w:hAnsi="Consolas"/>
+          <w:sz w:val="19"/>
         </w:rPr>
-        <w:t>player remembers its position (x, y), up or down speed (vy), rotation (rot), whether it has landed (onGround), and extra jumps (airJumps). Speed uses BASE_SPEED and the level’s speed setting (line 207).</w:t>
+        <w:t>BASE_SPEED</w:t>
+      </w:r>
+      <w:r>
+        <w:t xml:space="preserve"> and the level's speed setting (line 207).</w:t>
       </w:r>
     </w:p>
     <w:p>
       <w:pPr>
         <w:pStyle w:val="Heading2"/>
-        <w:spacing w:before="100" w:after="60"/>
       </w:pPr>
       <w:r>
         <w:t>The game loop</w:t>
       </w:r>
     </w:p>
     <w:p>
-      <w:pPr>
-        <w:spacing w:line="240" w:lineRule="auto" w:after="80"/>
-      </w:pPr>
+      <w:r/>
       <w:r>
         <w:rPr>
-          <w:sz w:val="21"/>
+          <w:rFonts w:ascii="Consolas" w:hAnsi="Consolas"/>
+          <w:sz w:val="19"/>
         </w:rPr>
-        <w:t>loop(now) repeats using requestAnimationFrame(loop) at lines 561–574, often about 60 times a second. update(dt) moves things and checks the rules. draw() draws the new picture. dt helps adjust for the time between frames.</w:t>
+        <w:t>loop(now)</w:t>
+      </w:r>
+      <w:r>
+        <w:t xml:space="preserve"> repeats through </w:t>
+      </w:r>
+      <w:r>
+        <w:rPr>
+          <w:rFonts w:ascii="Consolas" w:hAnsi="Consolas"/>
+          <w:sz w:val="19"/>
+        </w:rPr>
+        <w:t>requestAnimationFrame</w:t>
+      </w:r>
+      <w:r>
+        <w:t xml:space="preserve">, often about 60 times a second (lines 561–574). </w:t>
+      </w:r>
+      <w:r>
+        <w:rPr>
+          <w:rFonts w:ascii="Consolas" w:hAnsi="Consolas"/>
+          <w:sz w:val="19"/>
+        </w:rPr>
+        <w:t>update(dt)</w:t>
+      </w:r>
+      <w:r>
+        <w:t xml:space="preserve"> moves objects and checks the rules. </w:t>
+      </w:r>
+      <w:r>
+        <w:rPr>
+          <w:rFonts w:ascii="Consolas" w:hAnsi="Consolas"/>
+          <w:sz w:val="19"/>
+        </w:rPr>
+        <w:t>draw()</w:t>
+      </w:r>
+      <w:r>
+        <w:t xml:space="preserve"> draws the next picture. </w:t>
+      </w:r>
+      <w:r>
+        <w:rPr>
+          <w:rFonts w:ascii="Consolas" w:hAnsi="Consolas"/>
+          <w:sz w:val="19"/>
+        </w:rPr>
+        <w:t>dt</w:t>
+      </w:r>
+      <w:r>
+        <w:t xml:space="preserve"> adjusts for the time between frames.</w:t>
       </w:r>
     </w:p>
     <w:p>
       <w:pPr>
         <w:pStyle w:val="Codeexcerpt"/>
-        <w:shd w:fill="F2F4F6"/>
       </w:pPr>
       <w:r>
         <w:t>if(state !== 'menu' &amp;&amp; state !== 'win') update(dt);</w:t>
@@ -1029,47 +962,80 @@
     <w:p>
       <w:pPr>
         <w:pStyle w:val="Heading2"/>
-        <w:spacing w:before="100" w:after="60"/>
       </w:pPr>
       <w:r>
         <w:t>Input handling</w:t>
       </w:r>
     </w:p>
     <w:p>
-      <w:pPr>
-        <w:spacing w:line="240" w:lineRule="auto" w:after="80"/>
-      </w:pPr>
+      <w:r>
+        <w:t xml:space="preserve">Space, Up, W, clicking, or tapping makes the player jump. The listener changes </w:t>
+      </w:r>
       <w:r>
         <w:rPr>
-          <w:sz w:val="21"/>
+          <w:rFonts w:ascii="Consolas" w:hAnsi="Consolas"/>
+          <w:sz w:val="19"/>
         </w:rPr>
-        <w:t>Space, Up, W, clicking, or tapping makes the player jump. The keyboard listener is at lines 233–239. pressJump() changes jumpHeld and jumpQueued. update() changes player.vy to move the square upward. Letting go and pressing again in the air uses the double jump. Landing gives it back. Holding jump makes the square jump again after landing.</w:t>
+        <w:t>jumpHeld</w:t>
+      </w:r>
+      <w:r>
+        <w:t xml:space="preserve"> and </w:t>
+      </w:r>
+      <w:r>
+        <w:rPr>
+          <w:rFonts w:ascii="Consolas" w:hAnsi="Consolas"/>
+          <w:sz w:val="19"/>
+        </w:rPr>
+        <w:t>jumpQueued</w:t>
+      </w:r>
+      <w:r>
+        <w:t xml:space="preserve"> (lines 230–243). </w:t>
+      </w:r>
+      <w:r>
+        <w:rPr>
+          <w:rFonts w:ascii="Consolas" w:hAnsi="Consolas"/>
+          <w:sz w:val="19"/>
+        </w:rPr>
+        <w:t>update()</w:t>
+      </w:r>
+      <w:r>
+        <w:t xml:space="preserve"> changes </w:t>
+      </w:r>
+      <w:r>
+        <w:rPr>
+          <w:rFonts w:ascii="Consolas" w:hAnsi="Consolas"/>
+          <w:sz w:val="19"/>
+        </w:rPr>
+        <w:t>player.vy</w:t>
+      </w:r>
+      <w:r>
+        <w:t xml:space="preserve"> to move upward. Releasing and pressing again in the air uses the double jump; landing restores it.</w:t>
       </w:r>
     </w:p>
     <w:p>
       <w:pPr>
         <w:pStyle w:val="Heading2"/>
-        <w:spacing w:before="100" w:after="60"/>
       </w:pPr>
       <w:r>
         <w:t>Collision and win or lose logic</w:t>
       </w:r>
     </w:p>
     <w:p>
-      <w:pPr>
-        <w:spacing w:line="240" w:lineRule="auto" w:after="80"/>
-      </w:pPr>
+      <w:r/>
       <w:r>
         <w:rPr>
-          <w:sz w:val="21"/>
+          <w:rFonts w:ascii="Consolas" w:hAnsi="Consolas"/>
+          <w:sz w:val="19"/>
         </w:rPr>
-        <w:t>A hitbox is an invisible shape used to check whether things are touching. rectsOverlap(a,b) checks whether two rectangular hitboxes overlap (line 258):</w:t>
+        <w:t>rectsOverlap(a,b)</w:t>
+      </w:r>
+      <w:r>
+        <w:t xml:space="preserve"> checks whether invisible rectangular hitboxes overlap (line 258):</w:t>
       </w:r>
     </w:p>
     <w:p>
       <w:pPr>
         <w:pStyle w:val="Codeexcerpt"/>
-        <w:shd w:fill="F2F4F6"/>
       </w:pPr>
       <w:r>
         <w:t>a.x &lt; b.x+b.w &amp;&amp; a.x+a.w &gt; b.x &amp;&amp;</w:t>
@@ -1078,45 +1044,61 @@
       </w:r>
     </w:p>
     <w:p>
-      <w:pPr>
-        <w:spacing w:line="240" w:lineRule="auto" w:after="80"/>
-      </w:pPr>
+      <w:r>
+        <w:t xml:space="preserve">A spike collision runs </w:t>
+      </w:r>
       <w:r>
         <w:rPr>
-          <w:sz w:val="21"/>
+          <w:rFonts w:ascii="Consolas" w:hAnsi="Consolas"/>
+          <w:sz w:val="19"/>
         </w:rPr>
-        <w:t>Touching a spike runs die() (line 364). The level restarts after a short wait (lines 303–305). A block is safe when falling onto its top. The check is player.vy &gt;= 0 &amp;&amp; prevBottom &lt;= oy + 14 (line 368). Hitting its side makes the player lose.</w:t>
+        <w:t>die()</w:t>
       </w:r>
-    </w:p>
-    <w:p>
-      <w:pPr>
-        <w:spacing w:line="240" w:lineRule="auto" w:after="80"/>
-      </w:pPr>
+      <w:r>
+        <w:t xml:space="preserve">. Blocks are safe when falling onto their tops; the check is </w:t>
+      </w:r>
       <w:r>
         <w:rPr>
-          <w:sz w:val="21"/>
+          <w:rFonts w:ascii="Consolas" w:hAnsi="Consolas"/>
+          <w:sz w:val="19"/>
         </w:rPr>
-        <w:t>Reaching the portal’s horizontal position runs completeLevel() (line 383). The next level starts after a short wait. Finishing all five levels shows YOU WIN! (lines 308–315).</w:t>
+        <w:t>player.vy &gt;= 0 &amp;&amp; prevBottom &lt;= oy + 14</w:t>
+      </w:r>
+      <w:r>
+        <w:t xml:space="preserve"> (lines 364–371). A crash restarts the level. Reaching the portal starts the next level, and completing all five shows YOU WIN! (lines 308–315 and 383).</w:t>
       </w:r>
     </w:p>
     <w:p>
       <w:pPr>
         <w:pStyle w:val="Heading2"/>
-        <w:spacing w:before="100" w:after="60"/>
       </w:pPr>
       <w:r>
         <w:t>Scoring and progress</w:t>
       </w:r>
     </w:p>
     <w:p>
-      <w:pPr>
-        <w:spacing w:line="240" w:lineRule="auto" w:after="80"/>
-      </w:pPr>
+      <w:r>
+        <w:t xml:space="preserve">There are no points. </w:t>
+      </w:r>
       <w:r>
         <w:rPr>
-          <w:sz w:val="21"/>
+          <w:rFonts w:ascii="Consolas" w:hAnsi="Consolas"/>
+          <w:sz w:val="19"/>
         </w:rPr>
-        <w:t>There is no points score. attempts starts at 1, and attempts++ adds one when the player crashes (line 262). The progress bar shows how far the square has gone through the level. Lines 380–381 divide player.x by levelEndX() and change the bar’s width.</w:t>
+        <w:t>attempts++</w:t>
+      </w:r>
+      <w:r>
+        <w:t xml:space="preserve"> adds a try after a crash (line 262). Lines 380–381 calculate </w:t>
+      </w:r>
+      <w:r>
+        <w:rPr>
+          <w:rFonts w:ascii="Consolas" w:hAnsi="Consolas"/>
+          <w:sz w:val="19"/>
+        </w:rPr>
+        <w:t>player.x / levelEndX()</w:t>
+      </w:r>
+      <w:r>
+        <w:t xml:space="preserve"> and update the progress bar. A recorded test reached Level 2 with a new background, then confirmed that a spike added an attempt.</w:t>
       </w:r>
     </w:p>
     <w:p>
@@ -1124,7 +1106,7 @@
         <w:pStyle w:val="Caption"/>
       </w:pPr>
       <w:r>
-        <w:t>Code reference: neon-dash-v4-doublejump.html. The line numbers match the supplied 578-line file.</w:t>
+        <w:t>Line numbers refer to the linked five-level source file.</w:t>
       </w:r>
     </w:p>
     <w:p>
@@ -1145,8 +1127,8 @@
       <w:r>
         <w:drawing>
           <wp:inline xmlns:a="http://schemas.openxmlformats.org/drawingml/2006/main" xmlns:pic="http://schemas.openxmlformats.org/drawingml/2006/picture">
-            <wp:extent cx="5715000" cy="2678906"/>
-            <wp:docPr id="2" name="Picture 2" descr="The player double jumps above a spike in Level 1"/>
+            <wp:extent cx="5532120" cy="2593181"/>
+            <wp:docPr id="2" name="Picture 2" descr="The square double jumps above a spike"/>
             <wp:cNvGraphicFramePr>
               <a:graphicFrameLocks noChangeAspect="1"/>
             </wp:cNvGraphicFramePr>
@@ -1158,7 +1140,7 @@
                     <pic:cNvPicPr/>
                   </pic:nvPicPr>
                   <pic:blipFill>
-                    <a:blip r:embed="rId10"/>
+                    <a:blip r:embed="rId13"/>
                     <a:stretch>
                       <a:fillRect/>
                     </a:stretch>
@@ -1166,7 +1148,7 @@
                   <pic:spPr>
                     <a:xfrm>
                       <a:off x="0" y="0"/>
-                      <a:ext cx="5715000" cy="2678906"/>
+                      <a:ext cx="5532120" cy="2593181"/>
                     </a:xfrm>
                     <a:prstGeom prst="rect"/>
                   </pic:spPr>
@@ -1182,7 +1164,7 @@
         <w:pStyle w:val="Caption"/>
       </w:pPr>
       <w:r>
-        <w:t>Figure 2. The square is doing a double jump. The ring underneath it shows that the extra jump was used.</w:t>
+        <w:t>The ring below the square shows that the extra jump was used.</w:t>
       </w:r>
     </w:p>
     <w:p>
@@ -1207,7 +1189,7 @@
                     <pic:cNvPicPr/>
                   </pic:nvPicPr>
                   <pic:blipFill>
-                    <a:blip r:embed="rId11"/>
+                    <a:blip r:embed="rId14"/>
                     <a:stretch>
                       <a:fillRect/>
                     </a:stretch>
@@ -1232,7 +1214,7 @@
         <w:drawing>
           <wp:inline xmlns:a="http://schemas.openxmlformats.org/drawingml/2006/main" xmlns:pic="http://schemas.openxmlformats.org/drawingml/2006/picture">
             <wp:extent cx="2834640" cy="1328738"/>
-            <wp:docPr id="4" name="Picture 4" descr="Level 2 with a different background color"/>
+            <wp:docPr id="4" name="Picture 4" descr="Level 2 with a different background"/>
             <wp:cNvGraphicFramePr>
               <a:graphicFrameLocks noChangeAspect="1"/>
             </wp:cNvGraphicFramePr>
@@ -1244,7 +1226,7 @@
                     <pic:cNvPicPr/>
                   </pic:nvPicPr>
                   <pic:blipFill>
-                    <a:blip r:embed="rId12"/>
+                    <a:blip r:embed="rId15"/>
                     <a:stretch>
                       <a:fillRect/>
                     </a:stretch>
@@ -1268,7 +1250,7 @@
         <w:pStyle w:val="Caption"/>
       </w:pPr>
       <w:r>
-        <w:t>Figure 3 shows the portal at the end of Level 1. Figure 4 shows the new background in Level 2.</w:t>
+        <w:t>The Level 1 portal and the new background in Level 2.</w:t>
       </w:r>
     </w:p>
     <w:p>
@@ -1276,59 +1258,92 @@
         <w:pStyle w:val="Heading2"/>
       </w:pPr>
       <w:r>
-        <w:t>My goals for October 14 to October 18</w:t>
+        <w:t>Goals for October 15 to October 18</w:t>
       </w:r>
     </w:p>
     <w:p>
       <w:pPr>
-        <w:pStyle w:val="Heading2"/>
+        <w:pStyle w:val="ListBullet"/>
+        <w:spacing w:after="120"/>
       </w:pPr>
+      <w:r/>
       <w:r>
-        <w:t>Test the double jump by October 14</w:t>
+        <w:rPr>
+          <w:b/>
+        </w:rPr>
+        <w:t>By October 16:</w:t>
+      </w:r>
+      <w:r>
+        <w:t xml:space="preserve"> Test jumping ten times, including a second jump, an attempted third jump, and landing to restore the extra jump.</w:t>
+      </w:r>
+    </w:p>
+    <w:p>
+      <w:pPr>
+        <w:pStyle w:val="ListBullet"/>
+        <w:spacing w:after="120"/>
+      </w:pPr>
+      <w:r/>
+      <w:r>
+        <w:rPr>
+          <w:b/>
+        </w:rPr>
+        <w:t>By October 16:</w:t>
+      </w:r>
+      <w:r>
+        <w:t xml:space="preserve"> Check that the expanded tutorial teaches jumping, double jumping, and wave controls. Test its first visit and replay options, and save a screenshot.</w:t>
+      </w:r>
+    </w:p>
+    <w:p>
+      <w:pPr>
+        <w:pStyle w:val="ListBullet"/>
+        <w:spacing w:after="120"/>
+      </w:pPr>
+      <w:r/>
+      <w:r>
+        <w:rPr>
+          <w:b/>
+        </w:rPr>
+        <w:t>By October 18:</w:t>
+      </w:r>
+      <w:r>
+        <w:t xml:space="preserve"> Try each published level five times. Sample early, middle, and late levels in both expanded modes. Record progress, unfair sections, and whether both portals work.</w:t>
+      </w:r>
+    </w:p>
+    <w:p>
+      <w:pPr>
+        <w:pStyle w:val="ListBullet"/>
+        <w:spacing w:after="120"/>
+      </w:pPr>
+      <w:r/>
+      <w:r>
+        <w:rPr>
+          <w:b/>
+        </w:rPr>
+        <w:t>By October 18:</w:t>
+      </w:r>
+      <w:r>
+        <w:t xml:space="preserve"> Compare the same level at 800 × 600 and 1280 × 720. Save screenshots and check the ground, controls, and visible map.</w:t>
+      </w:r>
+    </w:p>
+    <w:p>
+      <w:pPr>
+        <w:pStyle w:val="ListBullet"/>
+        <w:spacing w:after="120"/>
+      </w:pPr>
+      <w:r/>
+      <w:r>
+        <w:rPr>
+          <w:b/>
+        </w:rPr>
+        <w:t>By October 18:</w:t>
+      </w:r>
+      <w:r>
+        <w:t xml:space="preserve"> Check all three languages for missing text or layout problems. Reload the expanded game to check that language and unlocked levels are saved.</w:t>
       </w:r>
     </w:p>
     <w:p>
       <w:r>
-        <w:t>I will test jumping ten times. I will check the first jump, the double jump, and what happens if I try a third jump. I will also check that landing gives the extra jump back. This will help me understand the jump variables.</w:t>
-      </w:r>
-    </w:p>
-    <w:p>
-      <w:pPr>
-        <w:pStyle w:val="Heading2"/>
-      </w:pPr>
-      <w:r>
-        <w:t>Fix the instructions by October 16</w:t>
-      </w:r>
-    </w:p>
-    <w:p>
-      <w:r>
-        <w:t>I will make a copy of the game and fix the strange symbols on the start screen. I will also explain that squares are only safe when landing on top. I will save a screenshot to show the changes.</w:t>
-      </w:r>
-    </w:p>
-    <w:p>
-      <w:pPr>
-        <w:pStyle w:val="Heading2"/>
-      </w:pPr>
-      <w:r>
-        <w:t>Check the levels by October 18</w:t>
-      </w:r>
-    </w:p>
-    <w:p>
-      <w:r>
-        <w:t>I will try each level five times and record my attempts and farthest progress. I can use a practice copy to start harder levels. If a section feels too hard, I will change the spacing and try it five more times to see if it feels better.</w:t>
-      </w:r>
-    </w:p>
-    <w:p>
-      <w:pPr>
-        <w:pStyle w:val="Heading2"/>
-      </w:pPr>
-      <w:r>
-        <w:t>Try two window sizes by October 18</w:t>
-      </w:r>
-    </w:p>
-    <w:p>
-      <w:r>
-        <w:t>I will try the game at 800 × 600 and 1280 × 720. I will take screenshots of the same level and compare the ground, controls, and how much of the map I can see. This will help me understand how the canvas size affects the game.</w:t>
+        <w:t>I used WebGPT for the game code and Codex to help organize and edit this journal.</w:t>
       </w:r>
     </w:p>
     <w:sectPr>
@@ -1816,14 +1831,15 @@
     <w:pPr>
       <w:keepNext/>
       <w:keepLines/>
-      <w:spacing w:before="200" w:after="0"/>
+      <w:spacing w:before="100" w:after="60"/>
       <w:outlineLvl w:val="2"/>
     </w:pPr>
     <w:rPr>
-      <w:rFonts w:asciiTheme="majorHAnsi" w:eastAsiaTheme="majorEastAsia" w:hAnsiTheme="majorHAnsi" w:cstheme="majorBidi"/>
+      <w:rFonts w:asciiTheme="majorHAnsi" w:eastAsiaTheme="majorEastAsia" w:hAnsiTheme="majorHAnsi" w:cstheme="majorBidi" w:ascii="Calibri" w:hAnsi="Calibri"/>
       <w:b/>
       <w:bCs/>
-      <w:color w:val="4F81BD" w:themeColor="accent1"/>
+      <w:color w:val="000000"/>
+      <w:sz w:val="22"/>
     </w:rPr>
   </w:style>
   <w:style w:type="paragraph" w:styleId="Heading4">
@@ -13406,7 +13422,7 @@
     <w:rPr>
       <w:rFonts w:ascii="Consolas" w:hAnsi="Consolas"/>
       <w:color w:val="000000"/>
-      <w:sz w:val="18"/>
+      <w:sz w:val="19"/>
     </w:rPr>
   </w:style>
 </w:styles>

</xml_diff>

<commit_message>
Include three complete detailed WebGPT prompts in the journal
</commit_message>
<xml_diff>
--- a/assets/neon-dash/neon-dash-development-journal.docx
+++ b/assets/neon-dash/neon-dash-development-journal.docx
@@ -1342,6 +1342,66 @@
       </w:r>
     </w:p>
     <w:p>
+      <w:pPr>
+        <w:pStyle w:val="Heading1"/>
+        <w:pageBreakBefore/>
+      </w:pPr>
+      <w:r>
+        <w:t>Complete WebGPT prompts</w:t>
+      </w:r>
+    </w:p>
+    <w:p>
+      <w:pPr>
+        <w:pStyle w:val="Heading2"/>
+      </w:pPr>
+      <w:r>
+        <w:t>Original game</w:t>
+      </w:r>
+    </w:p>
+    <w:p>
+      <w:pPr>
+        <w:pStyle w:val="Quote"/>
+        <w:keepLines/>
+      </w:pPr>
+      <w:r>
+        <w:t>Create a Geometry Dash-like game where you have to press space or other buttons to jump, and there are squares, which are safe to land on, and spikes, which will end the game once you touch them. Be creative with the maps. Add levels to this thing. once you completeed a level there will be a portal for you to enter. The color of the background color changes as you level up. Make everything very cool and intriguing.</w:t>
+      </w:r>
+    </w:p>
+    <w:p>
+      <w:pPr>
+        <w:pStyle w:val="Heading2"/>
+      </w:pPr>
+      <w:r>
+        <w:t>Menus levels and languages</w:t>
+      </w:r>
+    </w:p>
+    <w:p>
+      <w:pPr>
+        <w:pStyle w:val="Quote"/>
+        <w:keepLines/>
+      </w:pPr>
+      <w:r>
+        <w:t>Create a starting menu, add options for Dash-Lite and Dash-Extreme, each with 50 levels, each increasing in difficulty, and a setting to adjust the language, supporting Spanish, English, and Chinese. When you first enter the game, you are required to go through an instruction course that teaches you which button to press and what it does, such as jumping, double jumping, etc. Make the UI 1000000000% better.</w:t>
+      </w:r>
+    </w:p>
+    <w:p>
+      <w:pPr>
+        <w:pStyle w:val="Heading2"/>
+      </w:pPr>
+      <w:r>
+        <w:t>Wave movement and portals</w:t>
+      </w:r>
+    </w:p>
+    <w:p>
+      <w:pPr>
+        <w:pStyle w:val="Quote"/>
+        <w:keepLines/>
+      </w:pPr>
+      <w:r>
+        <w:t>I want that when you hit the portal, you switch into the flying line- another form, just like the real Geometry Dash- and when you hit a yellow, you win. Check how the real Geometry Dash is. I want it just like it is in the original game.</w:t>
+      </w:r>
+    </w:p>
+    <w:p>
       <w:r>
         <w:t>I used WebGPT for the game code and Codex to help organize and edit this journal.</w:t>
       </w:r>
@@ -2401,10 +2461,16 @@
     <w:uiPriority w:val="29"/>
     <w:qFormat/>
     <w:rsid w:val="00FC693F"/>
+    <w:pPr>
+      <w:spacing w:after="160"/>
+      <w:ind w:left="216" w:right="216"/>
+    </w:pPr>
     <w:rPr>
-      <w:i/>
+      <w:rFonts w:ascii="Calibri" w:hAnsi="Calibri"/>
+      <w:i w:val="0"/>
       <w:iCs/>
-      <w:color w:val="000000" w:themeColor="text1"/>
+      <w:color w:val="000000"/>
+      <w:sz w:val="22"/>
     </w:rPr>
   </w:style>
   <w:style w:type="character" w:customStyle="1" w:styleId="QuoteChar">

</xml_diff>

<commit_message>
Clarify AI collaboration, coding lessons and future development approach
</commit_message>
<xml_diff>
--- a/assets/neon-dash/neon-dash-development-journal.docx
+++ b/assets/neon-dash/neon-dash-development-journal.docx
@@ -54,7 +54,7 @@
     </w:p>
     <w:p>
       <w:r>
-        <w:t>In class, I used WebGPT to make a game like Geometry Dash. I chose the features and gave feedback while WebGPT generated the code. The linked game and screenshots show the five-level version. Later versions from my WebGPT chat add more features.</w:t>
+        <w:t>In class, I used WebGPT to make a game like Geometry Dash. WebGPT wrote the HTML, CSS, and JavaScript. I chose features, tried the results, and reported problems. The linked game and screenshots show the five-level version. Later versions from my WebGPT chat add more features.</w:t>
       </w:r>
     </w:p>
     <w:p>
@@ -75,7 +75,7 @@
     </w:p>
     <w:p>
       <w:r>
-        <w:t>I started with jumping, spikes, safe platforms, levels, and portals. The first game showed a black screen, so I reported it and WebGPT added canvas size checks. Level 1 was too hard, so I asked for an easier start and harder later levels. The base speed dropped from 7.2 to 6.0. I then requested a double jump and comments to help explain the code. Landing restores the extra jump.</w:t>
+        <w:t>I started with jumping, spikes, safe platforms, levels, and portals. The first result showed a black screen. I reported the problem, and WebGPT added checks for the canvas size. When Level 1 was too hard, I asked for an easier start and harder later levels. WebGPT lowered the base speed from 7.2 to 6.0 and spread out the early spikes. My feedback changed how the game worked and how hard it was. Next, I requested a double jump. WebGPT returned a version with one extra jump in the air, restored by landing. I also asked for comments to explain the code.</w:t>
       </w:r>
     </w:p>
     <w:p>
@@ -88,7 +88,7 @@
     </w:p>
     <w:p>
       <w:r>
-        <w:t>I asked for menus, Dash-Lite and Dash-Extreme with 50 levels each, English, Spanish, Chinese, and a tutorial. WebGPT returned an expanded version with generated levels and saved progress. Another revision added wave movement: a blue portal changes the cube into an arrow, holding makes it rise, releasing makes it fall, and a yellow portal finishes the level. My last request was to make Extreme much harder; the chat ends before a reply. These later versions still need testing.</w:t>
+        <w:t>I expanded my prompt to include menus, Dash-Lite and Dash-Extreme with 50 levels each, three languages, and a tutorial. WebGPT returned a version with generated levels and saved progress. I then asked for a flying-line form and a yellow finish portal. WebGPT interpreted this as wave mode: a blue portal changes the cube into an arrow, holding makes it rise, and releasing makes it fall. My last request was to make Extreme ten times harder; the chat ends before a reply. These later versions still need testing.</w:t>
       </w:r>
     </w:p>
     <w:p>
@@ -101,61 +101,25 @@
     </w:p>
     <w:p>
       <w:r>
-        <w:t>HTML provides the canvas and buttons, CSS controls their appearance, and JavaScript handles movement and rules. Variables remember things like the extra jump, while hitboxes check collisions. A square is safe to land on from above, but hitting its side makes the player lose. The expanded version also introduced repeatable level generation, translated text, and saved settings.</w:t>
+        <w:t>HTML provides the canvas and buttons, CSS controls their appearance, and JavaScript handles movement and rules. Double jumping helped me understand state: the game remembers whether the player has landed, whether the button press is new, and whether the extra jump is available. Landing resets that extra jump.</w:t>
       </w:r>
     </w:p>
     <w:p>
       <w:r>
-        <w:t>Next time, I would test one short level before adding more features. I would describe what I expected, what happened, and how to repeat a problem. Saving versions, screenshots, and test results would help me track changes and understand the code better.</w:t>
+        <w:t>I also learned that drawing and collision checks are separate. Invisible hitboxes decide whether the player lands or crashes. A block can look safe but still cause a crash when hit from the side. The later versions introduced generated levels, translated text, and saved settings, which I still need to study and test further.</w:t>
       </w:r>
     </w:p>
     <w:p>
       <w:pPr>
-        <w:keepNext/>
-        <w:spacing w:after="60"/>
-        <w:jc w:val="center"/>
+        <w:pStyle w:val="Heading1"/>
       </w:pPr>
       <w:r>
-        <w:drawing>
-          <wp:inline xmlns:a="http://schemas.openxmlformats.org/drawingml/2006/main" xmlns:pic="http://schemas.openxmlformats.org/drawingml/2006/picture">
-            <wp:extent cx="4754880" cy="2228850"/>
-            <wp:docPr id="1" name="Picture 1" descr="Game start screen with jump controls"/>
-            <wp:cNvGraphicFramePr>
-              <a:graphicFrameLocks noChangeAspect="1"/>
-            </wp:cNvGraphicFramePr>
-            <a:graphic>
-              <a:graphicData uri="http://schemas.openxmlformats.org/drawingml/2006/picture">
-                <pic:pic>
-                  <pic:nvPicPr>
-                    <pic:cNvPr id="0" name="01_menu.png"/>
-                    <pic:cNvPicPr/>
-                  </pic:nvPicPr>
-                  <pic:blipFill>
-                    <a:blip r:embed="rId12"/>
-                    <a:stretch>
-                      <a:fillRect/>
-                    </a:stretch>
-                  </pic:blipFill>
-                  <pic:spPr>
-                    <a:xfrm>
-                      <a:off x="0" y="0"/>
-                      <a:ext cx="4754880" cy="2228850"/>
-                    </a:xfrm>
-                    <a:prstGeom prst="rect"/>
-                  </pic:spPr>
-                </pic:pic>
-              </a:graphicData>
-            </a:graphic>
-          </wp:inline>
-        </w:drawing>
+        <w:t>How I would build software next time</w:t>
       </w:r>
     </w:p>
     <w:p>
-      <w:pPr>
-        <w:pStyle w:val="Caption"/>
-      </w:pPr>
       <w:r>
-        <w:t>The five-level game's start screen. Some symbols still display as strange text.</w:t>
+        <w:t>I would build one short level and test it before adding features. After each AI revision, I would read the changed code, repeat the test, and save the version, screenshot, and result. My prompts would explain what should happen, what went wrong, and how to repeat the problem. For difficulty, I would give clear targets such as speed and obstacle spacing.</w:t>
       </w:r>
     </w:p>
     <w:p>
@@ -1128,7 +1092,7 @@
         <w:drawing>
           <wp:inline xmlns:a="http://schemas.openxmlformats.org/drawingml/2006/main" xmlns:pic="http://schemas.openxmlformats.org/drawingml/2006/picture">
             <wp:extent cx="5532120" cy="2593181"/>
-            <wp:docPr id="2" name="Picture 2" descr="The square double jumps above a spike"/>
+            <wp:docPr id="1" name="Picture 1" descr="The square double jumps above a spike"/>
             <wp:cNvGraphicFramePr>
               <a:graphicFrameLocks noChangeAspect="1"/>
             </wp:cNvGraphicFramePr>
@@ -1140,7 +1104,7 @@
                     <pic:cNvPicPr/>
                   </pic:nvPicPr>
                   <pic:blipFill>
-                    <a:blip r:embed="rId13"/>
+                    <a:blip r:embed="rId12"/>
                     <a:stretch>
                       <a:fillRect/>
                     </a:stretch>
@@ -1177,7 +1141,7 @@
         <w:drawing>
           <wp:inline xmlns:a="http://schemas.openxmlformats.org/drawingml/2006/main" xmlns:pic="http://schemas.openxmlformats.org/drawingml/2006/picture">
             <wp:extent cx="2834640" cy="1328738"/>
-            <wp:docPr id="3" name="Picture 3" descr="The portal near the end of Level 1"/>
+            <wp:docPr id="2" name="Picture 2" descr="The portal near the end of Level 1"/>
             <wp:cNvGraphicFramePr>
               <a:graphicFrameLocks noChangeAspect="1"/>
             </wp:cNvGraphicFramePr>
@@ -1189,7 +1153,7 @@
                     <pic:cNvPicPr/>
                   </pic:nvPicPr>
                   <pic:blipFill>
-                    <a:blip r:embed="rId14"/>
+                    <a:blip r:embed="rId13"/>
                     <a:stretch>
                       <a:fillRect/>
                     </a:stretch>
@@ -1214,7 +1178,7 @@
         <w:drawing>
           <wp:inline xmlns:a="http://schemas.openxmlformats.org/drawingml/2006/main" xmlns:pic="http://schemas.openxmlformats.org/drawingml/2006/picture">
             <wp:extent cx="2834640" cy="1328738"/>
-            <wp:docPr id="4" name="Picture 4" descr="Level 2 with a different background"/>
+            <wp:docPr id="3" name="Picture 3" descr="Level 2 with a different background"/>
             <wp:cNvGraphicFramePr>
               <a:graphicFrameLocks noChangeAspect="1"/>
             </wp:cNvGraphicFramePr>
@@ -1226,7 +1190,7 @@
                     <pic:cNvPicPr/>
                   </pic:nvPicPr>
                   <pic:blipFill>
-                    <a:blip r:embed="rId15"/>
+                    <a:blip r:embed="rId14"/>
                     <a:stretch>
                       <a:fillRect/>
                     </a:stretch>
@@ -1365,6 +1329,55 @@
       </w:pPr>
       <w:r>
         <w:t>Create a Geometry Dash-like game where you have to press space or other buttons to jump, and there are squares, which are safe to land on, and spikes, which will end the game once you touch them. Be creative with the maps. Add levels to this thing. once you completeed a level there will be a portal for you to enter. The color of the background color changes as you level up. Make everything very cool and intriguing.</w:t>
+      </w:r>
+    </w:p>
+    <w:p>
+      <w:pPr>
+        <w:keepNext/>
+        <w:spacing w:after="60"/>
+        <w:jc w:val="center"/>
+      </w:pPr>
+      <w:r>
+        <w:drawing>
+          <wp:inline xmlns:a="http://schemas.openxmlformats.org/drawingml/2006/main" xmlns:pic="http://schemas.openxmlformats.org/drawingml/2006/picture">
+            <wp:extent cx="4754880" cy="2228850"/>
+            <wp:docPr id="4" name="Picture 4" descr="Game start screen with jump controls"/>
+            <wp:cNvGraphicFramePr>
+              <a:graphicFrameLocks noChangeAspect="1"/>
+            </wp:cNvGraphicFramePr>
+            <a:graphic>
+              <a:graphicData uri="http://schemas.openxmlformats.org/drawingml/2006/picture">
+                <pic:pic>
+                  <pic:nvPicPr>
+                    <pic:cNvPr id="0" name="01_menu.png"/>
+                    <pic:cNvPicPr/>
+                  </pic:nvPicPr>
+                  <pic:blipFill>
+                    <a:blip r:embed="rId15"/>
+                    <a:stretch>
+                      <a:fillRect/>
+                    </a:stretch>
+                  </pic:blipFill>
+                  <pic:spPr>
+                    <a:xfrm>
+                      <a:off x="0" y="0"/>
+                      <a:ext cx="4754880" cy="2228850"/>
+                    </a:xfrm>
+                    <a:prstGeom prst="rect"/>
+                  </pic:spPr>
+                </pic:pic>
+              </a:graphicData>
+            </a:graphic>
+          </wp:inline>
+        </w:drawing>
+      </w:r>
+    </w:p>
+    <w:p>
+      <w:pPr>
+        <w:pStyle w:val="Caption"/>
+      </w:pPr>
+      <w:r>
+        <w:t>The five-level game's start screen. Some symbols still display as strange text.</w:t>
       </w:r>
     </w:p>
     <w:p>

</xml_diff>

<commit_message>
Shorten journal and weave exact prompts into the development process
</commit_message>
<xml_diff>
--- a/assets/neon-dash/neon-dash-development-journal.docx
+++ b/assets/neon-dash/neon-dash-development-journal.docx
@@ -54,7 +54,7 @@
     </w:p>
     <w:p>
       <w:r>
-        <w:t>In class, I used WebGPT to make a game like Geometry Dash. WebGPT wrote the HTML, CSS, and JavaScript. I chose features, tried the results, and reported problems. The linked game and screenshots show the five-level version. Later versions from my WebGPT chat add more features.</w:t>
+        <w:t>In class, I used WebGPT to make a game like Geometry Dash. WebGPT wrote the HTML, CSS, and JavaScript. I gave the ideas, tried the results, and asked for fixes.</w:t>
       </w:r>
     </w:p>
     <w:p>
@@ -70,12 +70,21 @@
         <w:pStyle w:val="Heading2"/>
       </w:pPr>
       <w:r>
-        <w:t>October 12</w:t>
+        <w:t>October 12: Starting and fixing the game</w:t>
+      </w:r>
+    </w:p>
+    <w:p>
+      <w:pPr>
+        <w:pStyle w:val="Quote"/>
+        <w:keepLines/>
+      </w:pPr>
+      <w:r>
+        <w:t>Create a Geometry Dash-like game where you have to press space or other buttons to jump, and there are squares, which are safe to land on, and spikes, which will end the game once you touch them. Be creative with the maps. Add levels to this thing. once you completeed a level there will be a portal for you to enter. The color of the background color changes as you level up. Make everything very cool and intriguing.</w:t>
       </w:r>
     </w:p>
     <w:p>
       <w:r>
-        <w:t>I started with jumping, spikes, safe platforms, levels, and portals. The first result showed a black screen. I reported the problem, and WebGPT added checks for the canvas size. When Level 1 was too hard, I asked for an easier start and harder later levels. WebGPT lowered the base speed from 7.2 to 6.0 and spread out the early spikes. My feedback changed how the game worked and how hard it was. Next, I requested a double jump. WebGPT returned a version with one extra jump in the air, restored by landing. I also asked for comments to explain the code.</w:t>
+        <w:t>The first result had a black screen. I reported it, and WebGPT added canvas size checks. Level 1 was too hard, so I asked for an easier start. WebGPT lowered the speed and spread out the spikes. I then asked for double jumping and code comments. The new version allowed one extra jump in the air, which resets after landing.</w:t>
       </w:r>
     </w:p>
     <w:p>
@@ -83,17 +92,54 @@
         <w:pStyle w:val="Heading2"/>
       </w:pPr>
       <w:r>
-        <w:t>October 14</w:t>
+        <w:t>October 14: Adding more choices</w:t>
+      </w:r>
+    </w:p>
+    <w:p>
+      <w:pPr>
+        <w:pStyle w:val="Quote"/>
+        <w:keepLines/>
+      </w:pPr>
+      <w:r>
+        <w:t>Create a starting menu, add options for Dash-Lite and Dash-Extreme, each with 50 levels, each increasing in difficulty, and a setting to adjust the language, supporting Spanish, English, and Chinese. When you first enter the game, you are required to go through an instruction course that teaches you which button to press and what it does, such as jumping, double jumping, etc. Make the UI 1000000000% better.</w:t>
       </w:r>
     </w:p>
     <w:p>
       <w:r>
-        <w:t>I expanded my prompt to include menus, Dash-Lite and Dash-Extreme with 50 levels each, three languages, and a tutorial. WebGPT returned a version with generated levels and saved progress. I then asked for a flying-line form and a yellow finish portal. WebGPT interpreted this as wave mode: a blue portal changes the cube into an arrow, holding makes it rise, and releasing makes it fall. My last request was to make Extreme ten times harder; the chat ends before a reply. These later versions still need testing.</w:t>
+        <w:t>After working on jumping, I asked for more ways to play. WebGPT returned a version with menus, generated levels, a tutorial, languages, and saved progress.</w:t>
+      </w:r>
+    </w:p>
+    <w:p>
+      <w:pPr>
+        <w:pStyle w:val="Heading2"/>
+      </w:pPr>
+      <w:r>
+        <w:t>October 14: Changing the portals</w:t>
+      </w:r>
+    </w:p>
+    <w:p>
+      <w:pPr>
+        <w:pStyle w:val="Quote"/>
+        <w:keepLines/>
+      </w:pPr>
+      <w:r>
+        <w:t>I want that when you hit the portal, you switch into the flying line- another form, just like the real Geometry Dash- and when you hit a yellow, you win. Check how the real Geometry Dash is. I want it just like it is in the original game.</w:t>
+      </w:r>
+    </w:p>
+    <w:p>
+      <w:r>
+        <w:t>WebGPT added wave movement: a blue portal changes the player into an arrow, holding makes it rise, and releasing makes it fall. A yellow finish portal ends the level. My last request was to make Extreme ten times harder, but the chat ends before a reply.</w:t>
+      </w:r>
+    </w:p>
+    <w:p>
+      <w:r>
+        <w:t>The game and screenshots linked here show the five-level version. The later versions still need testing.</w:t>
       </w:r>
     </w:p>
     <w:p>
       <w:pPr>
         <w:pStyle w:val="Heading1"/>
+        <w:pageBreakBefore/>
       </w:pPr>
       <w:r>
         <w:t>What I learned</w:t>
@@ -101,12 +147,7 @@
     </w:p>
     <w:p>
       <w:r>
-        <w:t>HTML provides the canvas and buttons, CSS controls their appearance, and JavaScript handles movement and rules. Double jumping helped me understand state: the game remembers whether the player has landed, whether the button press is new, and whether the extra jump is available. Landing resets that extra jump.</w:t>
-      </w:r>
-    </w:p>
-    <w:p>
-      <w:r>
-        <w:t>I also learned that drawing and collision checks are separate. Invisible hitboxes decide whether the player lands or crashes. A block can look safe but still cause a crash when hit from the side. The later versions introduced generated levels, translated text, and saved settings, which I still need to study and test further.</w:t>
+        <w:t>HTML sets up the page, CSS controls its look, and JavaScript runs the rules. Double jumping helped me understand how variables remember things: the game tracks the extra jump and resets it after landing. I also learned that invisible hitboxes decide collisions. A block's top is safe, but its sides can cause a crash.</w:t>
       </w:r>
     </w:p>
     <w:p>
@@ -119,13 +160,12 @@
     </w:p>
     <w:p>
       <w:r>
-        <w:t>I would build one short level and test it before adding features. After each AI revision, I would read the changed code, repeat the test, and save the version, screenshot, and result. My prompts would explain what should happen, what went wrong, and how to repeat the problem. For difficulty, I would give clear targets such as speed and obstacle spacing.</w:t>
+        <w:t>I would start with one level and test each AI change before adding more. I would read the changed code and save working versions. My prompts would explain what should happen, what went wrong, and how to repeat the problem.</w:t>
       </w:r>
     </w:p>
     <w:p>
       <w:pPr>
         <w:pStyle w:val="Heading1"/>
-        <w:pageBreakBefore/>
       </w:pPr>
       <w:r>
         <w:t>How the published game works</w:t>
@@ -159,7 +199,7 @@
         <w:t>syncSize()</w:t>
       </w:r>
       <w:r>
-        <w:t xml:space="preserve"> matches it to the browser window (lines 78–89). These screenshots use 1280 × 600 pixels. A wider window shows more of the map; a taller one moves the ground. Blocks stay the same size.</w:t>
+        <w:t xml:space="preserve"> fits it to the window (lines 78–89). These screenshots are 1280 × 600 pixels. More width shows more map; more height moves the ground. Blocks stay the same size.</w:t>
       </w:r>
     </w:p>
     <w:p>
@@ -172,672 +212,47 @@
     </w:p>
     <w:p>
       <w:r>
-        <w:t>Most variables are declared under STATE; jump controls are under INPUT.</w:t>
+        <w:t xml:space="preserve">Under STATE (lines 198–212), </w:t>
       </w:r>
-    </w:p>
-    <w:tbl>
-      <w:tblPr>
-        <w:tblW w:type="auto" w:w="0"/>
-        <w:tblLayout w:type="fixed"/>
-        <w:tblLook w:firstColumn="1" w:firstRow="1" w:lastColumn="0" w:lastRow="0" w:noHBand="0" w:noVBand="1" w:val="04A0"/>
-      </w:tblPr>
-      <w:tblGrid>
-        <w:gridCol w:w="3360"/>
-        <w:gridCol w:w="3360"/>
-        <w:gridCol w:w="3360"/>
-      </w:tblGrid>
-      <w:tr>
-        <w:trPr>
-          <w:cantSplit/>
-          <w:tblHeader/>
-        </w:trPr>
-        <w:tc>
-          <w:tcPr>
-            <w:tcW w:type="dxa" w:w="2808"/>
-            <w:vAlign w:val="center"/>
-            <w:shd w:fill="DCE6EF"/>
-            <w:tcMar>
-              <w:top w:w="70" w:type="dxa"/>
-              <w:left w:w="70" w:type="dxa"/>
-              <w:bottom w:w="70" w:type="dxa"/>
-              <w:right w:w="70" w:type="dxa"/>
-            </w:tcMar>
-            <w:tcBorders>
-              <w:top w:val="single" w:sz="4" w:color="D9D9D9"/>
-              <w:left w:val="single" w:sz="4" w:color="D9D9D9"/>
-              <w:bottom w:val="single" w:sz="4" w:color="D9D9D9"/>
-              <w:right w:val="single" w:sz="4" w:color="D9D9D9"/>
-            </w:tcBorders>
-          </w:tcPr>
-          <w:p>
-            <w:pPr>
-              <w:spacing w:after="0" w:line="240" w:lineRule="auto"/>
-            </w:pPr>
-            <w:r>
-              <w:rPr>
-                <w:b/>
-                <w:sz w:val="18"/>
-              </w:rPr>
-              <w:t>Variable</w:t>
-            </w:r>
-          </w:p>
-        </w:tc>
-        <w:tc>
-          <w:tcPr>
-            <w:tcW w:type="dxa" w:w="5400"/>
-            <w:vAlign w:val="center"/>
-            <w:shd w:fill="DCE6EF"/>
-            <w:tcMar>
-              <w:top w:w="70" w:type="dxa"/>
-              <w:left w:w="70" w:type="dxa"/>
-              <w:bottom w:w="70" w:type="dxa"/>
-              <w:right w:w="70" w:type="dxa"/>
-            </w:tcMar>
-            <w:tcBorders>
-              <w:top w:val="single" w:sz="4" w:color="D9D9D9"/>
-              <w:left w:val="single" w:sz="4" w:color="D9D9D9"/>
-              <w:bottom w:val="single" w:sz="4" w:color="D9D9D9"/>
-              <w:right w:val="single" w:sz="4" w:color="D9D9D9"/>
-            </w:tcBorders>
-          </w:tcPr>
-          <w:p>
-            <w:pPr>
-              <w:spacing w:after="0" w:line="240" w:lineRule="auto"/>
-            </w:pPr>
-            <w:r>
-              <w:rPr>
-                <w:b/>
-                <w:sz w:val="18"/>
-              </w:rPr>
-              <w:t>What it remembers</w:t>
-            </w:r>
-          </w:p>
-        </w:tc>
-        <w:tc>
-          <w:tcPr>
-            <w:tcW w:type="dxa" w:w="1872"/>
-            <w:vAlign w:val="center"/>
-            <w:shd w:fill="DCE6EF"/>
-            <w:tcMar>
-              <w:top w:w="70" w:type="dxa"/>
-              <w:left w:w="70" w:type="dxa"/>
-              <w:bottom w:w="70" w:type="dxa"/>
-              <w:right w:w="70" w:type="dxa"/>
-            </w:tcMar>
-            <w:tcBorders>
-              <w:top w:val="single" w:sz="4" w:color="D9D9D9"/>
-              <w:left w:val="single" w:sz="4" w:color="D9D9D9"/>
-              <w:bottom w:val="single" w:sz="4" w:color="D9D9D9"/>
-              <w:right w:val="single" w:sz="4" w:color="D9D9D9"/>
-            </w:tcBorders>
-          </w:tcPr>
-          <w:p>
-            <w:pPr>
-              <w:spacing w:after="0" w:line="240" w:lineRule="auto"/>
-            </w:pPr>
-            <w:r>
-              <w:rPr>
-                <w:b/>
-                <w:sz w:val="18"/>
-              </w:rPr>
-              <w:t>Code lines</w:t>
-            </w:r>
-          </w:p>
-        </w:tc>
-      </w:tr>
-      <w:tr>
-        <w:trPr>
-          <w:cantSplit/>
-        </w:trPr>
-        <w:tc>
-          <w:tcPr>
-            <w:tcW w:type="dxa" w:w="2808"/>
-            <w:vAlign w:val="center"/>
-            <w:shd w:fill="FFFFFF"/>
-            <w:tcMar>
-              <w:top w:w="70" w:type="dxa"/>
-              <w:left w:w="70" w:type="dxa"/>
-              <w:bottom w:w="70" w:type="dxa"/>
-              <w:right w:w="70" w:type="dxa"/>
-            </w:tcMar>
-            <w:tcBorders>
-              <w:top w:val="single" w:sz="4" w:color="D9D9D9"/>
-              <w:left w:val="single" w:sz="4" w:color="D9D9D9"/>
-              <w:bottom w:val="single" w:sz="4" w:color="D9D9D9"/>
-              <w:right w:val="single" w:sz="4" w:color="D9D9D9"/>
-            </w:tcBorders>
-          </w:tcPr>
-          <w:p>
-            <w:pPr>
-              <w:spacing w:after="0" w:line="240" w:lineRule="auto"/>
-            </w:pPr>
-            <w:r>
-              <w:rPr>
-                <w:b w:val="0"/>
-                <w:sz w:val="18"/>
-              </w:rPr>
-            </w:r>
-            <w:r>
-              <w:rPr>
-                <w:rFonts w:ascii="Consolas" w:hAnsi="Consolas"/>
-                <w:b w:val="0"/>
-                <w:sz w:val="18"/>
-              </w:rPr>
-              <w:t>state</w:t>
-            </w:r>
-            <w:r>
-              <w:rPr>
-                <w:b w:val="0"/>
-                <w:sz w:val="18"/>
-              </w:rPr>
-              <w:t xml:space="preserve">, </w:t>
-            </w:r>
-            <w:r>
-              <w:rPr>
-                <w:rFonts w:ascii="Consolas" w:hAnsi="Consolas"/>
-                <w:b w:val="0"/>
-                <w:sz w:val="18"/>
-              </w:rPr>
-              <w:t>levelIdx</w:t>
-            </w:r>
-            <w:r>
-              <w:rPr>
-                <w:b w:val="0"/>
-                <w:sz w:val="18"/>
-              </w:rPr>
-              <w:t xml:space="preserve">, </w:t>
-            </w:r>
-            <w:r>
-              <w:rPr>
-                <w:rFonts w:ascii="Consolas" w:hAnsi="Consolas"/>
-                <w:b w:val="0"/>
-                <w:sz w:val="18"/>
-              </w:rPr>
-              <w:t>attempts</w:t>
-            </w:r>
-            <w:r>
-              <w:rPr>
-                <w:b w:val="0"/>
-                <w:sz w:val="18"/>
-              </w:rPr>
-            </w:r>
-          </w:p>
-        </w:tc>
-        <w:tc>
-          <w:tcPr>
-            <w:tcW w:type="dxa" w:w="5400"/>
-            <w:vAlign w:val="center"/>
-            <w:shd w:fill="FFFFFF"/>
-            <w:tcMar>
-              <w:top w:w="70" w:type="dxa"/>
-              <w:left w:w="70" w:type="dxa"/>
-              <w:bottom w:w="70" w:type="dxa"/>
-              <w:right w:w="70" w:type="dxa"/>
-            </w:tcMar>
-            <w:tcBorders>
-              <w:top w:val="single" w:sz="4" w:color="D9D9D9"/>
-              <w:left w:val="single" w:sz="4" w:color="D9D9D9"/>
-              <w:bottom w:val="single" w:sz="4" w:color="D9D9D9"/>
-              <w:right w:val="single" w:sz="4" w:color="D9D9D9"/>
-            </w:tcBorders>
-          </w:tcPr>
-          <w:p>
-            <w:pPr>
-              <w:spacing w:after="0" w:line="240" w:lineRule="auto"/>
-            </w:pPr>
-            <w:r>
-              <w:rPr>
-                <w:b w:val="0"/>
-                <w:sz w:val="18"/>
-              </w:rPr>
-              <w:t>Game status, level, and tries</w:t>
-            </w:r>
-          </w:p>
-        </w:tc>
-        <w:tc>
-          <w:tcPr>
-            <w:tcW w:type="dxa" w:w="1872"/>
-            <w:vAlign w:val="center"/>
-            <w:shd w:fill="FFFFFF"/>
-            <w:tcMar>
-              <w:top w:w="70" w:type="dxa"/>
-              <w:left w:w="70" w:type="dxa"/>
-              <w:bottom w:w="70" w:type="dxa"/>
-              <w:right w:w="70" w:type="dxa"/>
-            </w:tcMar>
-            <w:tcBorders>
-              <w:top w:val="single" w:sz="4" w:color="D9D9D9"/>
-              <w:left w:val="single" w:sz="4" w:color="D9D9D9"/>
-              <w:bottom w:val="single" w:sz="4" w:color="D9D9D9"/>
-              <w:right w:val="single" w:sz="4" w:color="D9D9D9"/>
-            </w:tcBorders>
-          </w:tcPr>
-          <w:p>
-            <w:pPr>
-              <w:spacing w:after="0" w:line="240" w:lineRule="auto"/>
-            </w:pPr>
-            <w:r>
-              <w:rPr>
-                <w:b w:val="0"/>
-                <w:sz w:val="18"/>
-              </w:rPr>
-              <w:t>198–200</w:t>
-            </w:r>
-          </w:p>
-        </w:tc>
-      </w:tr>
-      <w:tr>
-        <w:trPr>
-          <w:cantSplit/>
-        </w:trPr>
-        <w:tc>
-          <w:tcPr>
-            <w:tcW w:type="dxa" w:w="2808"/>
-            <w:vAlign w:val="center"/>
-            <w:shd w:fill="F7F9FA"/>
-            <w:tcMar>
-              <w:top w:w="70" w:type="dxa"/>
-              <w:left w:w="70" w:type="dxa"/>
-              <w:bottom w:w="70" w:type="dxa"/>
-              <w:right w:w="70" w:type="dxa"/>
-            </w:tcMar>
-            <w:tcBorders>
-              <w:top w:val="single" w:sz="4" w:color="D9D9D9"/>
-              <w:left w:val="single" w:sz="4" w:color="D9D9D9"/>
-              <w:bottom w:val="single" w:sz="4" w:color="D9D9D9"/>
-              <w:right w:val="single" w:sz="4" w:color="D9D9D9"/>
-            </w:tcBorders>
-          </w:tcPr>
-          <w:p>
-            <w:pPr>
-              <w:spacing w:after="0" w:line="240" w:lineRule="auto"/>
-            </w:pPr>
-            <w:r>
-              <w:rPr>
-                <w:b w:val="0"/>
-                <w:sz w:val="18"/>
-              </w:rPr>
-            </w:r>
-            <w:r>
-              <w:rPr>
-                <w:rFonts w:ascii="Consolas" w:hAnsi="Consolas"/>
-                <w:b w:val="0"/>
-                <w:sz w:val="18"/>
-              </w:rPr>
-              <w:t>player</w:t>
-            </w:r>
-            <w:r>
-              <w:rPr>
-                <w:b w:val="0"/>
-                <w:sz w:val="18"/>
-              </w:rPr>
-            </w:r>
-          </w:p>
-        </w:tc>
-        <w:tc>
-          <w:tcPr>
-            <w:tcW w:type="dxa" w:w="5400"/>
-            <w:vAlign w:val="center"/>
-            <w:shd w:fill="F7F9FA"/>
-            <w:tcMar>
-              <w:top w:w="70" w:type="dxa"/>
-              <w:left w:w="70" w:type="dxa"/>
-              <w:bottom w:w="70" w:type="dxa"/>
-              <w:right w:w="70" w:type="dxa"/>
-            </w:tcMar>
-            <w:tcBorders>
-              <w:top w:val="single" w:sz="4" w:color="D9D9D9"/>
-              <w:left w:val="single" w:sz="4" w:color="D9D9D9"/>
-              <w:bottom w:val="single" w:sz="4" w:color="D9D9D9"/>
-              <w:right w:val="single" w:sz="4" w:color="D9D9D9"/>
-            </w:tcBorders>
-          </w:tcPr>
-          <w:p>
-            <w:pPr>
-              <w:spacing w:after="0" w:line="240" w:lineRule="auto"/>
-            </w:pPr>
-            <w:r>
-              <w:rPr>
-                <w:b w:val="0"/>
-                <w:sz w:val="18"/>
-              </w:rPr>
-              <w:t xml:space="preserve">Position </w:t>
-            </w:r>
-            <w:r>
-              <w:rPr>
-                <w:rFonts w:ascii="Consolas" w:hAnsi="Consolas"/>
-                <w:b w:val="0"/>
-                <w:sz w:val="18"/>
-              </w:rPr>
-              <w:t>x, y</w:t>
-            </w:r>
-            <w:r>
-              <w:rPr>
-                <w:b w:val="0"/>
-                <w:sz w:val="18"/>
-              </w:rPr>
-              <w:t xml:space="preserve">, vertical speed </w:t>
-            </w:r>
-            <w:r>
-              <w:rPr>
-                <w:rFonts w:ascii="Consolas" w:hAnsi="Consolas"/>
-                <w:b w:val="0"/>
-                <w:sz w:val="18"/>
-              </w:rPr>
-              <w:t>vy</w:t>
-            </w:r>
-            <w:r>
-              <w:rPr>
-                <w:b w:val="0"/>
-                <w:sz w:val="18"/>
-              </w:rPr>
-              <w:t>, rotation, landing, and extra jumps</w:t>
-            </w:r>
-          </w:p>
-        </w:tc>
-        <w:tc>
-          <w:tcPr>
-            <w:tcW w:type="dxa" w:w="1872"/>
-            <w:vAlign w:val="center"/>
-            <w:shd w:fill="F7F9FA"/>
-            <w:tcMar>
-              <w:top w:w="70" w:type="dxa"/>
-              <w:left w:w="70" w:type="dxa"/>
-              <w:bottom w:w="70" w:type="dxa"/>
-              <w:right w:w="70" w:type="dxa"/>
-            </w:tcMar>
-            <w:tcBorders>
-              <w:top w:val="single" w:sz="4" w:color="D9D9D9"/>
-              <w:left w:val="single" w:sz="4" w:color="D9D9D9"/>
-              <w:bottom w:val="single" w:sz="4" w:color="D9D9D9"/>
-              <w:right w:val="single" w:sz="4" w:color="D9D9D9"/>
-            </w:tcBorders>
-          </w:tcPr>
-          <w:p>
-            <w:pPr>
-              <w:spacing w:after="0" w:line="240" w:lineRule="auto"/>
-            </w:pPr>
-            <w:r>
-              <w:rPr>
-                <w:b w:val="0"/>
-                <w:sz w:val="18"/>
-              </w:rPr>
-              <w:t>212</w:t>
-            </w:r>
-          </w:p>
-        </w:tc>
-      </w:tr>
-      <w:tr>
-        <w:trPr>
-          <w:cantSplit/>
-        </w:trPr>
-        <w:tc>
-          <w:tcPr>
-            <w:tcW w:type="dxa" w:w="2808"/>
-            <w:vAlign w:val="center"/>
-            <w:shd w:fill="FFFFFF"/>
-            <w:tcMar>
-              <w:top w:w="70" w:type="dxa"/>
-              <w:left w:w="70" w:type="dxa"/>
-              <w:bottom w:w="70" w:type="dxa"/>
-              <w:right w:w="70" w:type="dxa"/>
-            </w:tcMar>
-            <w:tcBorders>
-              <w:top w:val="single" w:sz="4" w:color="D9D9D9"/>
-              <w:left w:val="single" w:sz="4" w:color="D9D9D9"/>
-              <w:bottom w:val="single" w:sz="4" w:color="D9D9D9"/>
-              <w:right w:val="single" w:sz="4" w:color="D9D9D9"/>
-            </w:tcBorders>
-          </w:tcPr>
-          <w:p>
-            <w:pPr>
-              <w:spacing w:after="0" w:line="240" w:lineRule="auto"/>
-            </w:pPr>
-            <w:r>
-              <w:rPr>
-                <w:b w:val="0"/>
-                <w:sz w:val="18"/>
-              </w:rPr>
-            </w:r>
-            <w:r>
-              <w:rPr>
-                <w:rFonts w:ascii="Consolas" w:hAnsi="Consolas"/>
-                <w:b w:val="0"/>
-                <w:sz w:val="18"/>
-              </w:rPr>
-              <w:t>W</w:t>
-            </w:r>
-            <w:r>
-              <w:rPr>
-                <w:b w:val="0"/>
-                <w:sz w:val="18"/>
-              </w:rPr>
-              <w:t xml:space="preserve">, </w:t>
-            </w:r>
-            <w:r>
-              <w:rPr>
-                <w:rFonts w:ascii="Consolas" w:hAnsi="Consolas"/>
-                <w:b w:val="0"/>
-                <w:sz w:val="18"/>
-              </w:rPr>
-              <w:t>H</w:t>
-            </w:r>
-            <w:r>
-              <w:rPr>
-                <w:b w:val="0"/>
-                <w:sz w:val="18"/>
-              </w:rPr>
-              <w:t xml:space="preserve">, </w:t>
-            </w:r>
-            <w:r>
-              <w:rPr>
-                <w:rFonts w:ascii="Consolas" w:hAnsi="Consolas"/>
-                <w:b w:val="0"/>
-                <w:sz w:val="18"/>
-              </w:rPr>
-              <w:t>camX</w:t>
-            </w:r>
-            <w:r>
-              <w:rPr>
-                <w:b w:val="0"/>
-                <w:sz w:val="18"/>
-              </w:rPr>
-            </w:r>
-          </w:p>
-        </w:tc>
-        <w:tc>
-          <w:tcPr>
-            <w:tcW w:type="dxa" w:w="5400"/>
-            <w:vAlign w:val="center"/>
-            <w:shd w:fill="FFFFFF"/>
-            <w:tcMar>
-              <w:top w:w="70" w:type="dxa"/>
-              <w:left w:w="70" w:type="dxa"/>
-              <w:bottom w:w="70" w:type="dxa"/>
-              <w:right w:w="70" w:type="dxa"/>
-            </w:tcMar>
-            <w:tcBorders>
-              <w:top w:val="single" w:sz="4" w:color="D9D9D9"/>
-              <w:left w:val="single" w:sz="4" w:color="D9D9D9"/>
-              <w:bottom w:val="single" w:sz="4" w:color="D9D9D9"/>
-              <w:right w:val="single" w:sz="4" w:color="D9D9D9"/>
-            </w:tcBorders>
-          </w:tcPr>
-          <w:p>
-            <w:pPr>
-              <w:spacing w:after="0" w:line="240" w:lineRule="auto"/>
-            </w:pPr>
-            <w:r>
-              <w:rPr>
-                <w:b w:val="0"/>
-                <w:sz w:val="18"/>
-              </w:rPr>
-              <w:t>Canvas size and camera position</w:t>
-            </w:r>
-          </w:p>
-        </w:tc>
-        <w:tc>
-          <w:tcPr>
-            <w:tcW w:type="dxa" w:w="1872"/>
-            <w:vAlign w:val="center"/>
-            <w:shd w:fill="FFFFFF"/>
-            <w:tcMar>
-              <w:top w:w="70" w:type="dxa"/>
-              <w:left w:w="70" w:type="dxa"/>
-              <w:bottom w:w="70" w:type="dxa"/>
-              <w:right w:w="70" w:type="dxa"/>
-            </w:tcMar>
-            <w:tcBorders>
-              <w:top w:val="single" w:sz="4" w:color="D9D9D9"/>
-              <w:left w:val="single" w:sz="4" w:color="D9D9D9"/>
-              <w:bottom w:val="single" w:sz="4" w:color="D9D9D9"/>
-              <w:right w:val="single" w:sz="4" w:color="D9D9D9"/>
-            </w:tcBorders>
-          </w:tcPr>
-          <w:p>
-            <w:pPr>
-              <w:spacing w:after="0" w:line="240" w:lineRule="auto"/>
-            </w:pPr>
-            <w:r>
-              <w:rPr>
-                <w:b w:val="0"/>
-                <w:sz w:val="18"/>
-              </w:rPr>
-              <w:t>79; 200</w:t>
-            </w:r>
-          </w:p>
-        </w:tc>
-      </w:tr>
-      <w:tr>
-        <w:trPr>
-          <w:cantSplit/>
-        </w:trPr>
-        <w:tc>
-          <w:tcPr>
-            <w:tcW w:type="dxa" w:w="2808"/>
-            <w:vAlign w:val="center"/>
-            <w:shd w:fill="F7F9FA"/>
-            <w:tcMar>
-              <w:top w:w="70" w:type="dxa"/>
-              <w:left w:w="70" w:type="dxa"/>
-              <w:bottom w:w="70" w:type="dxa"/>
-              <w:right w:w="70" w:type="dxa"/>
-            </w:tcMar>
-            <w:tcBorders>
-              <w:top w:val="single" w:sz="4" w:color="D9D9D9"/>
-              <w:left w:val="single" w:sz="4" w:color="D9D9D9"/>
-              <w:bottom w:val="single" w:sz="4" w:color="D9D9D9"/>
-              <w:right w:val="single" w:sz="4" w:color="D9D9D9"/>
-            </w:tcBorders>
-          </w:tcPr>
-          <w:p>
-            <w:pPr>
-              <w:spacing w:after="0" w:line="240" w:lineRule="auto"/>
-            </w:pPr>
-            <w:r>
-              <w:rPr>
-                <w:b w:val="0"/>
-                <w:sz w:val="18"/>
-              </w:rPr>
-            </w:r>
-            <w:r>
-              <w:rPr>
-                <w:rFonts w:ascii="Consolas" w:hAnsi="Consolas"/>
-                <w:b w:val="0"/>
-                <w:sz w:val="18"/>
-              </w:rPr>
-              <w:t>jumpHeld</w:t>
-            </w:r>
-            <w:r>
-              <w:rPr>
-                <w:b w:val="0"/>
-                <w:sz w:val="18"/>
-              </w:rPr>
-              <w:t xml:space="preserve">, </w:t>
-            </w:r>
-            <w:r>
-              <w:rPr>
-                <w:rFonts w:ascii="Consolas" w:hAnsi="Consolas"/>
-                <w:b w:val="0"/>
-                <w:sz w:val="18"/>
-              </w:rPr>
-              <w:t>jumpQueued</w:t>
-            </w:r>
-            <w:r>
-              <w:rPr>
-                <w:b w:val="0"/>
-                <w:sz w:val="18"/>
-              </w:rPr>
-            </w:r>
-          </w:p>
-        </w:tc>
-        <w:tc>
-          <w:tcPr>
-            <w:tcW w:type="dxa" w:w="5400"/>
-            <w:vAlign w:val="center"/>
-            <w:shd w:fill="F7F9FA"/>
-            <w:tcMar>
-              <w:top w:w="70" w:type="dxa"/>
-              <w:left w:w="70" w:type="dxa"/>
-              <w:bottom w:w="70" w:type="dxa"/>
-              <w:right w:w="70" w:type="dxa"/>
-            </w:tcMar>
-            <w:tcBorders>
-              <w:top w:val="single" w:sz="4" w:color="D9D9D9"/>
-              <w:left w:val="single" w:sz="4" w:color="D9D9D9"/>
-              <w:bottom w:val="single" w:sz="4" w:color="D9D9D9"/>
-              <w:right w:val="single" w:sz="4" w:color="D9D9D9"/>
-            </w:tcBorders>
-          </w:tcPr>
-          <w:p>
-            <w:pPr>
-              <w:spacing w:after="0" w:line="240" w:lineRule="auto"/>
-            </w:pPr>
-            <w:r>
-              <w:rPr>
-                <w:b w:val="0"/>
-                <w:sz w:val="18"/>
-              </w:rPr>
-              <w:t>Holding jump or making a new press</w:t>
-            </w:r>
-          </w:p>
-        </w:tc>
-        <w:tc>
-          <w:tcPr>
-            <w:tcW w:type="dxa" w:w="1872"/>
-            <w:vAlign w:val="center"/>
-            <w:shd w:fill="F7F9FA"/>
-            <w:tcMar>
-              <w:top w:w="70" w:type="dxa"/>
-              <w:left w:w="70" w:type="dxa"/>
-              <w:bottom w:w="70" w:type="dxa"/>
-              <w:right w:w="70" w:type="dxa"/>
-            </w:tcMar>
-            <w:tcBorders>
-              <w:top w:val="single" w:sz="4" w:color="D9D9D9"/>
-              <w:left w:val="single" w:sz="4" w:color="D9D9D9"/>
-              <w:bottom w:val="single" w:sz="4" w:color="D9D9D9"/>
-              <w:right w:val="single" w:sz="4" w:color="D9D9D9"/>
-            </w:tcBorders>
-          </w:tcPr>
-          <w:p>
-            <w:pPr>
-              <w:spacing w:after="0" w:line="240" w:lineRule="auto"/>
-            </w:pPr>
-            <w:r>
-              <w:rPr>
-                <w:b w:val="0"/>
-                <w:sz w:val="18"/>
-              </w:rPr>
-              <w:t>230</w:t>
-            </w:r>
-          </w:p>
-        </w:tc>
-      </w:tr>
-    </w:tbl>
-    <w:p>
       <w:r>
-        <w:t xml:space="preserve">Forward speed uses </w:t>
+        <w:rPr>
+          <w:rFonts w:ascii="Consolas" w:hAnsi="Consolas"/>
+          <w:sz w:val="19"/>
+        </w:rPr>
+        <w:t>state</w:t>
+      </w:r>
+      <w:r>
+        <w:t xml:space="preserve">, </w:t>
+      </w:r>
+      <w:r>
+        <w:rPr>
+          <w:rFonts w:ascii="Consolas" w:hAnsi="Consolas"/>
+          <w:sz w:val="19"/>
+        </w:rPr>
+        <w:t>levelIdx</w:t>
+      </w:r>
+      <w:r>
+        <w:t xml:space="preserve">, and </w:t>
+      </w:r>
+      <w:r>
+        <w:rPr>
+          <w:rFonts w:ascii="Consolas" w:hAnsi="Consolas"/>
+          <w:sz w:val="19"/>
+        </w:rPr>
+        <w:t>attempts</w:t>
+      </w:r>
+      <w:r>
+        <w:t xml:space="preserve"> track game status, level, and tries. </w:t>
+      </w:r>
+      <w:r>
+        <w:rPr>
+          <w:rFonts w:ascii="Consolas" w:hAnsi="Consolas"/>
+          <w:sz w:val="19"/>
+        </w:rPr>
+        <w:t>player</w:t>
+      </w:r>
+      <w:r>
+        <w:t xml:space="preserve"> stores position, vertical speed, and jumps. Forward speed uses </w:t>
       </w:r>
       <w:r>
         <w:rPr>
@@ -847,7 +262,7 @@
         <w:t>BASE_SPEED</w:t>
       </w:r>
       <w:r>
-        <w:t xml:space="preserve"> and the level's speed setting (line 207).</w:t>
+        <w:t xml:space="preserve"> and the level setting. Jump flags are under INPUT (line 230).</w:t>
       </w:r>
     </w:p>
     <w:p>
@@ -868,7 +283,7 @@
         <w:t>loop(now)</w:t>
       </w:r>
       <w:r>
-        <w:t xml:space="preserve"> repeats through </w:t>
+        <w:t xml:space="preserve"> uses </w:t>
       </w:r>
       <w:r>
         <w:rPr>
@@ -878,7 +293,7 @@
         <w:t>requestAnimationFrame</w:t>
       </w:r>
       <w:r>
-        <w:t xml:space="preserve">, often about 60 times a second (lines 561–574). </w:t>
+        <w:t xml:space="preserve">, often about 60 times a second (lines 561–574). It calls </w:t>
       </w:r>
       <w:r>
         <w:rPr>
@@ -888,7 +303,7 @@
         <w:t>update(dt)</w:t>
       </w:r>
       <w:r>
-        <w:t xml:space="preserve"> moves objects and checks the rules. </w:t>
+        <w:t xml:space="preserve"> to move things and check rules, then </w:t>
       </w:r>
       <w:r>
         <w:rPr>
@@ -898,7 +313,7 @@
         <w:t>draw()</w:t>
       </w:r>
       <w:r>
-        <w:t xml:space="preserve"> draws the next picture. </w:t>
+        <w:t xml:space="preserve"> to draw the frame. </w:t>
       </w:r>
       <w:r>
         <w:rPr>
@@ -908,19 +323,7 @@
         <w:t>dt</w:t>
       </w:r>
       <w:r>
-        <w:t xml:space="preserve"> adjusts for the time between frames.</w:t>
-      </w:r>
-    </w:p>
-    <w:p>
-      <w:pPr>
-        <w:pStyle w:val="Codeexcerpt"/>
-      </w:pPr>
-      <w:r>
-        <w:t>if(state !== 'menu' &amp;&amp; state !== 'win') update(dt);</w:t>
-        <w:br/>
-        <w:t>try { draw(); } catch(e) {}</w:t>
-        <w:br/>
-        <w:t>requestAnimationFrame(loop);</w:t>
+        <w:t xml:space="preserve"> adjusts for time between frames.</w:t>
       </w:r>
     </w:p>
     <w:p>
@@ -933,7 +336,7 @@
     </w:p>
     <w:p>
       <w:r>
-        <w:t xml:space="preserve">Space, Up, W, clicking, or tapping makes the player jump. The listener changes </w:t>
+        <w:t xml:space="preserve">Space, Up, W, clicking, or tapping jumps. The listeners change </w:t>
       </w:r>
       <w:r>
         <w:rPr>
@@ -953,7 +356,7 @@
         <w:t>jumpQueued</w:t>
       </w:r>
       <w:r>
-        <w:t xml:space="preserve"> (lines 230–243). </w:t>
+        <w:t xml:space="preserve">; </w:t>
       </w:r>
       <w:r>
         <w:rPr>
@@ -973,7 +376,7 @@
         <w:t>player.vy</w:t>
       </w:r>
       <w:r>
-        <w:t xml:space="preserve"> to move upward. Releasing and pressing again in the air uses the double jump; landing restores it.</w:t>
+        <w:t>. A new press in the air uses the extra jump (lines 230–243).</w:t>
       </w:r>
     </w:p>
     <w:p>
@@ -994,7 +397,7 @@
         <w:t>rectsOverlap(a,b)</w:t>
       </w:r>
       <w:r>
-        <w:t xml:space="preserve"> checks whether invisible rectangular hitboxes overlap (line 258):</w:t>
+        <w:t xml:space="preserve"> checks hitboxes (line 258):</w:t>
       </w:r>
     </w:p>
     <w:p>
@@ -1009,7 +412,7 @@
     </w:p>
     <w:p>
       <w:r>
-        <w:t xml:space="preserve">A spike collision runs </w:t>
+        <w:t xml:space="preserve">Spikes call </w:t>
       </w:r>
       <w:r>
         <w:rPr>
@@ -1019,7 +422,7 @@
         <w:t>die()</w:t>
       </w:r>
       <w:r>
-        <w:t xml:space="preserve">. Blocks are safe when falling onto their tops; the check is </w:t>
+        <w:t xml:space="preserve">. Safe landings check </w:t>
       </w:r>
       <w:r>
         <w:rPr>
@@ -1029,7 +432,7 @@
         <w:t>player.vy &gt;= 0 &amp;&amp; prevBottom &lt;= oy + 14</w:t>
       </w:r>
       <w:r>
-        <w:t xml:space="preserve"> (lines 364–371). A crash restarts the level. Reaching the portal starts the next level, and completing all five shows YOU WIN! (lines 308–315 and 383).</w:t>
+        <w:t xml:space="preserve"> (lines 364–371). Crashes restart the level. Portals lead to the next level; finishing all five shows YOU WIN!</w:t>
       </w:r>
     </w:p>
     <w:p>
@@ -1052,7 +455,7 @@
         <w:t>attempts++</w:t>
       </w:r>
       <w:r>
-        <w:t xml:space="preserve"> adds a try after a crash (line 262). Lines 380–381 calculate </w:t>
+        <w:t xml:space="preserve"> counts crashes (line 262). </w:t>
       </w:r>
       <w:r>
         <w:rPr>
@@ -1062,7 +465,7 @@
         <w:t>player.x / levelEndX()</w:t>
       </w:r>
       <w:r>
-        <w:t xml:space="preserve"> and update the progress bar. A recorded test reached Level 2 with a new background, then confirmed that a spike added an attempt.</w:t>
+        <w:t xml:space="preserve"> fills the progress bar (lines 380–381). A recorded test reached Level 2 and confirmed that a spike added an attempt.</w:t>
       </w:r>
     </w:p>
     <w:p>
@@ -1091,8 +494,8 @@
       <w:r>
         <w:drawing>
           <wp:inline xmlns:a="http://schemas.openxmlformats.org/drawingml/2006/main" xmlns:pic="http://schemas.openxmlformats.org/drawingml/2006/picture">
-            <wp:extent cx="5532120" cy="2593181"/>
-            <wp:docPr id="1" name="Picture 1" descr="The square double jumps above a spike"/>
+            <wp:extent cx="2834640" cy="1328738"/>
+            <wp:docPr id="1" name="Picture 1" descr="Game start screen with jump controls"/>
             <wp:cNvGraphicFramePr>
               <a:graphicFrameLocks noChangeAspect="1"/>
             </wp:cNvGraphicFramePr>
@@ -1100,60 +503,11 @@
               <a:graphicData uri="http://schemas.openxmlformats.org/drawingml/2006/picture">
                 <pic:pic>
                   <pic:nvPicPr>
-                    <pic:cNvPr id="0" name="02_double_jump.png"/>
+                    <pic:cNvPr id="0" name="01_menu.png"/>
                     <pic:cNvPicPr/>
                   </pic:nvPicPr>
                   <pic:blipFill>
                     <a:blip r:embed="rId12"/>
-                    <a:stretch>
-                      <a:fillRect/>
-                    </a:stretch>
-                  </pic:blipFill>
-                  <pic:spPr>
-                    <a:xfrm>
-                      <a:off x="0" y="0"/>
-                      <a:ext cx="5532120" cy="2593181"/>
-                    </a:xfrm>
-                    <a:prstGeom prst="rect"/>
-                  </pic:spPr>
-                </pic:pic>
-              </a:graphicData>
-            </a:graphic>
-          </wp:inline>
-        </w:drawing>
-      </w:r>
-    </w:p>
-    <w:p>
-      <w:pPr>
-        <w:pStyle w:val="Caption"/>
-      </w:pPr>
-      <w:r>
-        <w:t>The ring below the square shows that the extra jump was used.</w:t>
-      </w:r>
-    </w:p>
-    <w:p>
-      <w:pPr>
-        <w:keepNext/>
-        <w:spacing w:after="60"/>
-        <w:jc w:val="center"/>
-      </w:pPr>
-      <w:r>
-        <w:drawing>
-          <wp:inline xmlns:a="http://schemas.openxmlformats.org/drawingml/2006/main" xmlns:pic="http://schemas.openxmlformats.org/drawingml/2006/picture">
-            <wp:extent cx="2834640" cy="1328738"/>
-            <wp:docPr id="2" name="Picture 2" descr="The portal near the end of Level 1"/>
-            <wp:cNvGraphicFramePr>
-              <a:graphicFrameLocks noChangeAspect="1"/>
-            </wp:cNvGraphicFramePr>
-            <a:graphic>
-              <a:graphicData uri="http://schemas.openxmlformats.org/drawingml/2006/picture">
-                <pic:pic>
-                  <pic:nvPicPr>
-                    <pic:cNvPr id="0" name="03_portal.png"/>
-                    <pic:cNvPicPr/>
-                  </pic:nvPicPr>
-                  <pic:blipFill>
-                    <a:blip r:embed="rId13"/>
                     <a:stretch>
                       <a:fillRect/>
                     </a:stretch>
@@ -1178,7 +532,7 @@
         <w:drawing>
           <wp:inline xmlns:a="http://schemas.openxmlformats.org/drawingml/2006/main" xmlns:pic="http://schemas.openxmlformats.org/drawingml/2006/picture">
             <wp:extent cx="2834640" cy="1328738"/>
-            <wp:docPr id="3" name="Picture 3" descr="Level 2 with a different background"/>
+            <wp:docPr id="2" name="Picture 2" descr="The square double jumps above a spike"/>
             <wp:cNvGraphicFramePr>
               <a:graphicFrameLocks noChangeAspect="1"/>
             </wp:cNvGraphicFramePr>
@@ -1186,11 +540,11 @@
               <a:graphicData uri="http://schemas.openxmlformats.org/drawingml/2006/picture">
                 <pic:pic>
                   <pic:nvPicPr>
-                    <pic:cNvPr id="0" name="04_level_two.png"/>
+                    <pic:cNvPr id="0" name="02_double_jump.png"/>
                     <pic:cNvPicPr/>
                   </pic:nvPicPr>
                   <pic:blipFill>
-                    <a:blip r:embed="rId14"/>
+                    <a:blip r:embed="rId13"/>
                     <a:stretch>
                       <a:fillRect/>
                     </a:stretch>
@@ -1214,7 +568,93 @@
         <w:pStyle w:val="Caption"/>
       </w:pPr>
       <w:r>
-        <w:t>The Level 1 portal and the new background in Level 2.</w:t>
+        <w:t>The start screen and double jump. Some menu symbols still appear as strange text.</w:t>
+      </w:r>
+    </w:p>
+    <w:p>
+      <w:pPr>
+        <w:keepNext/>
+        <w:spacing w:after="60"/>
+        <w:jc w:val="center"/>
+      </w:pPr>
+      <w:r>
+        <w:drawing>
+          <wp:inline xmlns:a="http://schemas.openxmlformats.org/drawingml/2006/main" xmlns:pic="http://schemas.openxmlformats.org/drawingml/2006/picture">
+            <wp:extent cx="2834640" cy="1328738"/>
+            <wp:docPr id="3" name="Picture 3" descr="The portal near the end of Level 1"/>
+            <wp:cNvGraphicFramePr>
+              <a:graphicFrameLocks noChangeAspect="1"/>
+            </wp:cNvGraphicFramePr>
+            <a:graphic>
+              <a:graphicData uri="http://schemas.openxmlformats.org/drawingml/2006/picture">
+                <pic:pic>
+                  <pic:nvPicPr>
+                    <pic:cNvPr id="0" name="03_portal.png"/>
+                    <pic:cNvPicPr/>
+                  </pic:nvPicPr>
+                  <pic:blipFill>
+                    <a:blip r:embed="rId14"/>
+                    <a:stretch>
+                      <a:fillRect/>
+                    </a:stretch>
+                  </pic:blipFill>
+                  <pic:spPr>
+                    <a:xfrm>
+                      <a:off x="0" y="0"/>
+                      <a:ext cx="2834640" cy="1328738"/>
+                    </a:xfrm>
+                    <a:prstGeom prst="rect"/>
+                  </pic:spPr>
+                </pic:pic>
+              </a:graphicData>
+            </a:graphic>
+          </wp:inline>
+        </w:drawing>
+      </w:r>
+      <w:r>
+        <w:t xml:space="preserve">  </w:t>
+      </w:r>
+      <w:r>
+        <w:drawing>
+          <wp:inline xmlns:a="http://schemas.openxmlformats.org/drawingml/2006/main" xmlns:pic="http://schemas.openxmlformats.org/drawingml/2006/picture">
+            <wp:extent cx="2834640" cy="1328738"/>
+            <wp:docPr id="4" name="Picture 4" descr="Level 2 with a different background"/>
+            <wp:cNvGraphicFramePr>
+              <a:graphicFrameLocks noChangeAspect="1"/>
+            </wp:cNvGraphicFramePr>
+            <a:graphic>
+              <a:graphicData uri="http://schemas.openxmlformats.org/drawingml/2006/picture">
+                <pic:pic>
+                  <pic:nvPicPr>
+                    <pic:cNvPr id="0" name="04_level_two.png"/>
+                    <pic:cNvPicPr/>
+                  </pic:nvPicPr>
+                  <pic:blipFill>
+                    <a:blip r:embed="rId15"/>
+                    <a:stretch>
+                      <a:fillRect/>
+                    </a:stretch>
+                  </pic:blipFill>
+                  <pic:spPr>
+                    <a:xfrm>
+                      <a:off x="0" y="0"/>
+                      <a:ext cx="2834640" cy="1328738"/>
+                    </a:xfrm>
+                    <a:prstGeom prst="rect"/>
+                  </pic:spPr>
+                </pic:pic>
+              </a:graphicData>
+            </a:graphic>
+          </wp:inline>
+        </w:drawing>
+      </w:r>
+    </w:p>
+    <w:p>
+      <w:pPr>
+        <w:pStyle w:val="Caption"/>
+      </w:pPr>
+      <w:r>
+        <w:t>The Level 1 portal leads to Level 2 with a different background.</w:t>
       </w:r>
     </w:p>
     <w:p>
@@ -1238,23 +678,7 @@
         <w:t>By October 16:</w:t>
       </w:r>
       <w:r>
-        <w:t xml:space="preserve"> Test jumping ten times, including a second jump, an attempted third jump, and landing to restore the extra jump.</w:t>
-      </w:r>
-    </w:p>
-    <w:p>
-      <w:pPr>
-        <w:pStyle w:val="ListBullet"/>
-        <w:spacing w:after="120"/>
-      </w:pPr>
-      <w:r/>
-      <w:r>
-        <w:rPr>
-          <w:b/>
-        </w:rPr>
-        <w:t>By October 16:</w:t>
-      </w:r>
-      <w:r>
-        <w:t xml:space="preserve"> Check that the expanded tutorial teaches jumping, double jumping, and wave controls. Test its first visit and replay options, and save a screenshot.</w:t>
+        <w:t xml:space="preserve"> Test double jumping ten times. Check that a third jump fails and landing restores the extra jump.</w:t>
       </w:r>
     </w:p>
     <w:p>
@@ -1270,7 +694,7 @@
         <w:t>By October 18:</w:t>
       </w:r>
       <w:r>
-        <w:t xml:space="preserve"> Try each published level five times. Sample early, middle, and late levels in both expanded modes. Record progress, unfair sections, and whether both portals work.</w:t>
+        <w:t xml:space="preserve"> Try each published level five times and sample both expanded modes. Record unfair obstacles and check both portal types.</w:t>
       </w:r>
     </w:p>
     <w:p>
@@ -1286,7 +710,7 @@
         <w:t>By October 18:</w:t>
       </w:r>
       <w:r>
-        <w:t xml:space="preserve"> Compare the same level at 800 × 600 and 1280 × 720. Save screenshots and check the ground, controls, and visible map.</w:t>
+        <w:t xml:space="preserve"> Test the later tutorial, all three languages, and saved progress after reloading.</w:t>
       </w:r>
     </w:p>
     <w:p>
@@ -1302,121 +726,12 @@
         <w:t>By October 18:</w:t>
       </w:r>
       <w:r>
-        <w:t xml:space="preserve"> Check all three languages for missing text or layout problems. Reload the expanded game to check that language and unlocked levels are saved.</w:t>
-      </w:r>
-    </w:p>
-    <w:p>
-      <w:pPr>
-        <w:pStyle w:val="Heading1"/>
-        <w:pageBreakBefore/>
-      </w:pPr>
-      <w:r>
-        <w:t>Complete WebGPT prompts</w:t>
-      </w:r>
-    </w:p>
-    <w:p>
-      <w:pPr>
-        <w:pStyle w:val="Heading2"/>
-      </w:pPr>
-      <w:r>
-        <w:t>Original game</w:t>
-      </w:r>
-    </w:p>
-    <w:p>
-      <w:pPr>
-        <w:pStyle w:val="Quote"/>
-        <w:keepLines/>
-      </w:pPr>
-      <w:r>
-        <w:t>Create a Geometry Dash-like game where you have to press space or other buttons to jump, and there are squares, which are safe to land on, and spikes, which will end the game once you touch them. Be creative with the maps. Add levels to this thing. once you completeed a level there will be a portal for you to enter. The color of the background color changes as you level up. Make everything very cool and intriguing.</w:t>
-      </w:r>
-    </w:p>
-    <w:p>
-      <w:pPr>
-        <w:keepNext/>
-        <w:spacing w:after="60"/>
-        <w:jc w:val="center"/>
-      </w:pPr>
-      <w:r>
-        <w:drawing>
-          <wp:inline xmlns:a="http://schemas.openxmlformats.org/drawingml/2006/main" xmlns:pic="http://schemas.openxmlformats.org/drawingml/2006/picture">
-            <wp:extent cx="4754880" cy="2228850"/>
-            <wp:docPr id="4" name="Picture 4" descr="Game start screen with jump controls"/>
-            <wp:cNvGraphicFramePr>
-              <a:graphicFrameLocks noChangeAspect="1"/>
-            </wp:cNvGraphicFramePr>
-            <a:graphic>
-              <a:graphicData uri="http://schemas.openxmlformats.org/drawingml/2006/picture">
-                <pic:pic>
-                  <pic:nvPicPr>
-                    <pic:cNvPr id="0" name="01_menu.png"/>
-                    <pic:cNvPicPr/>
-                  </pic:nvPicPr>
-                  <pic:blipFill>
-                    <a:blip r:embed="rId15"/>
-                    <a:stretch>
-                      <a:fillRect/>
-                    </a:stretch>
-                  </pic:blipFill>
-                  <pic:spPr>
-                    <a:xfrm>
-                      <a:off x="0" y="0"/>
-                      <a:ext cx="4754880" cy="2228850"/>
-                    </a:xfrm>
-                    <a:prstGeom prst="rect"/>
-                  </pic:spPr>
-                </pic:pic>
-              </a:graphicData>
-            </a:graphic>
-          </wp:inline>
-        </w:drawing>
-      </w:r>
-    </w:p>
-    <w:p>
-      <w:pPr>
-        <w:pStyle w:val="Caption"/>
-      </w:pPr>
-      <w:r>
-        <w:t>The five-level game's start screen. Some symbols still display as strange text.</w:t>
-      </w:r>
-    </w:p>
-    <w:p>
-      <w:pPr>
-        <w:pStyle w:val="Heading2"/>
-      </w:pPr>
-      <w:r>
-        <w:t>Menus levels and languages</w:t>
-      </w:r>
-    </w:p>
-    <w:p>
-      <w:pPr>
-        <w:pStyle w:val="Quote"/>
-        <w:keepLines/>
-      </w:pPr>
-      <w:r>
-        <w:t>Create a starting menu, add options for Dash-Lite and Dash-Extreme, each with 50 levels, each increasing in difficulty, and a setting to adjust the language, supporting Spanish, English, and Chinese. When you first enter the game, you are required to go through an instruction course that teaches you which button to press and what it does, such as jumping, double jumping, etc. Make the UI 1000000000% better.</w:t>
-      </w:r>
-    </w:p>
-    <w:p>
-      <w:pPr>
-        <w:pStyle w:val="Heading2"/>
-      </w:pPr>
-      <w:r>
-        <w:t>Wave movement and portals</w:t>
-      </w:r>
-    </w:p>
-    <w:p>
-      <w:pPr>
-        <w:pStyle w:val="Quote"/>
-        <w:keepLines/>
-      </w:pPr>
-      <w:r>
-        <w:t>I want that when you hit the portal, you switch into the flying line- another form, just like the real Geometry Dash- and when you hit a yellow, you win. Check how the real Geometry Dash is. I want it just like it is in the original game.</w:t>
+        <w:t xml:space="preserve"> Compare 800 × 600 and 1280 × 720 screenshots. Check the ground and controls, and fix the strange menu symbols.</w:t>
       </w:r>
     </w:p>
     <w:p>
       <w:r>
-        <w:t>I used WebGPT for the game code and Codex to help organize and edit this journal.</w:t>
+        <w:t>I used WebGPT for the game code and Codex to help edit this journal.</w:t>
       </w:r>
     </w:p>
     <w:sectPr>

</xml_diff>

<commit_message>
Credit ChatGPT for the journal format and theme
</commit_message>
<xml_diff>
--- a/assets/neon-dash/neon-dash-development-journal.docx
+++ b/assets/neon-dash/neon-dash-development-journal.docx
@@ -734,6 +734,18 @@
         <w:t>I used WebGPT for the game code and Codex to help edit this journal.</w:t>
       </w:r>
     </w:p>
+    <w:p>
+      <w:r/>
+      <w:r>
+        <w:rPr>
+          <w:b/>
+        </w:rPr>
+        <w:t>Journal credit:</w:t>
+      </w:r>
+      <w:r>
+        <w:t xml:space="preserve"> ChatGPT helped me with the format and theme of this journal.</w:t>
+      </w:r>
+    </w:p>
     <w:sectPr>
       <w:pgSz w:w="12240" w:h="15840"/>
       <w:pgMar w:top="936" w:right="1080" w:bottom="936" w:left="1080" w:header="720" w:footer="720" w:gutter="0"/>

</xml_diff>

<commit_message>
Add reflection on web languages and specific AI prompts
</commit_message>
<xml_diff>
--- a/assets/neon-dash/neon-dash-development-journal.docx
+++ b/assets/neon-dash/neon-dash-development-journal.docx
@@ -15,7 +15,7 @@
         <w:pStyle w:val="Subtitle"/>
       </w:pPr>
       <w:r>
-        <w:t>Innovators Journal  |  October 13, 2026  |  Updated October 15, 2026</w:t>
+        <w:t>Innovators Journal  |  October 13, 2026  |  Updated October 18, 2026</w:t>
       </w:r>
     </w:p>
     <w:p>
@@ -151,6 +151,31 @@
       </w:r>
     </w:p>
     <w:p>
+      <w:r>
+        <w:t xml:space="preserve">I now understand more about how HTML, CSS, and JavaScript work together. In HTML, the </w:t>
+      </w:r>
+      <w:r>
+        <w:rPr>
+          <w:rFonts w:ascii="Consolas" w:hAnsi="Consolas"/>
+          <w:sz w:val="19"/>
+        </w:rPr>
+        <w:t>&lt;head&gt;</w:t>
+      </w:r>
+      <w:r>
+        <w:t xml:space="preserve"> holds page information and styles, and the </w:t>
+      </w:r>
+      <w:r>
+        <w:rPr>
+          <w:rFonts w:ascii="Consolas" w:hAnsi="Consolas"/>
+          <w:sz w:val="19"/>
+        </w:rPr>
+        <w:t>&lt;body&gt;</w:t>
+      </w:r>
+      <w:r>
+        <w:t xml:space="preserve"> holds visible parts like buttons and the canvas. CSS controls how they look, while JavaScript adds movement and controls. I also learned that AI prompts need clear details. Asking for a UI that is millions of percent better does not tell the AI what to change. I should name specific effects and settings, like buttons that are 20% bigger, a dark blue background, or a jump height of two blocks, so the AI has a clear direction.</w:t>
+      </w:r>
+    </w:p>
+    <w:p>
       <w:pPr>
         <w:pStyle w:val="Heading1"/>
       </w:pPr>
@@ -160,7 +185,7 @@
     </w:p>
     <w:p>
       <w:r>
-        <w:t>I would start with one level and test each AI change before adding more. I would read the changed code and save working versions. My prompts would explain what should happen, what went wrong, and how to repeat the problem.</w:t>
+        <w:t>Next time, I would start with one level and test each change before adding more. I would save working versions and ask AI to explain code I do not understand. My prompts would explain what should happen, what went wrong, and how to repeat the problem. AI helped me build the game, but I still needed to decide what worked and what to improve.</w:t>
       </w:r>
     </w:p>
     <w:p>
@@ -168,312 +193,17 @@
         <w:pStyle w:val="Heading1"/>
       </w:pPr>
       <w:r>
-        <w:t>How the published game works</w:t>
-      </w:r>
-    </w:p>
-    <w:p>
-      <w:pPr>
-        <w:pStyle w:val="Heading2"/>
-      </w:pPr>
-      <w:r>
-        <w:t>The canvas</w:t>
-      </w:r>
-    </w:p>
-    <w:p>
-      <w:r/>
-      <w:r>
-        <w:rPr>
-          <w:rFonts w:ascii="Consolas" w:hAnsi="Consolas"/>
-          <w:sz w:val="19"/>
-        </w:rPr>
-        <w:t>&lt;canvas id="game"&gt;&lt;/canvas&gt;</w:t>
-      </w:r>
-      <w:r>
-        <w:t xml:space="preserve"> is at line 58. </w:t>
-      </w:r>
-      <w:r>
-        <w:rPr>
-          <w:rFonts w:ascii="Consolas" w:hAnsi="Consolas"/>
-          <w:sz w:val="19"/>
-        </w:rPr>
-        <w:t>syncSize()</w:t>
-      </w:r>
-      <w:r>
-        <w:t xml:space="preserve"> fits it to the window (lines 78–89). These screenshots are 1280 × 600 pixels. More width shows more map; more height moves the ground. Blocks stay the same size.</w:t>
-      </w:r>
-    </w:p>
-    <w:p>
-      <w:pPr>
-        <w:pStyle w:val="Heading2"/>
-      </w:pPr>
-      <w:r>
-        <w:t>The state variables</w:t>
+        <w:t>How the game works</w:t>
       </w:r>
     </w:p>
     <w:p>
       <w:r>
-        <w:t xml:space="preserve">Under STATE (lines 198–212), </w:t>
-      </w:r>
-      <w:r>
-        <w:rPr>
-          <w:rFonts w:ascii="Consolas" w:hAnsi="Consolas"/>
-          <w:sz w:val="19"/>
-        </w:rPr>
-        <w:t>state</w:t>
-      </w:r>
-      <w:r>
-        <w:t xml:space="preserve">, </w:t>
-      </w:r>
-      <w:r>
-        <w:rPr>
-          <w:rFonts w:ascii="Consolas" w:hAnsi="Consolas"/>
-          <w:sz w:val="19"/>
-        </w:rPr>
-        <w:t>levelIdx</w:t>
-      </w:r>
-      <w:r>
-        <w:t xml:space="preserve">, and </w:t>
-      </w:r>
-      <w:r>
-        <w:rPr>
-          <w:rFonts w:ascii="Consolas" w:hAnsi="Consolas"/>
-          <w:sz w:val="19"/>
-        </w:rPr>
-        <w:t>attempts</w:t>
-      </w:r>
-      <w:r>
-        <w:t xml:space="preserve"> track game status, level, and tries. </w:t>
-      </w:r>
-      <w:r>
-        <w:rPr>
-          <w:rFonts w:ascii="Consolas" w:hAnsi="Consolas"/>
-          <w:sz w:val="19"/>
-        </w:rPr>
-        <w:t>player</w:t>
-      </w:r>
-      <w:r>
-        <w:t xml:space="preserve"> stores position, vertical speed, and jumps. Forward speed uses </w:t>
-      </w:r>
-      <w:r>
-        <w:rPr>
-          <w:rFonts w:ascii="Consolas" w:hAnsi="Consolas"/>
-          <w:sz w:val="19"/>
-        </w:rPr>
-        <w:t>BASE_SPEED</w:t>
-      </w:r>
-      <w:r>
-        <w:t xml:space="preserve"> and the level setting. Jump flags are under INPUT (line 230).</w:t>
-      </w:r>
-    </w:p>
-    <w:p>
-      <w:pPr>
-        <w:pStyle w:val="Heading2"/>
-      </w:pPr>
-      <w:r>
-        <w:t>The game loop</w:t>
-      </w:r>
-    </w:p>
-    <w:p>
-      <w:r/>
-      <w:r>
-        <w:rPr>
-          <w:rFonts w:ascii="Consolas" w:hAnsi="Consolas"/>
-          <w:sz w:val="19"/>
-        </w:rPr>
-        <w:t>loop(now)</w:t>
-      </w:r>
-      <w:r>
-        <w:t xml:space="preserve"> uses </w:t>
-      </w:r>
-      <w:r>
-        <w:rPr>
-          <w:rFonts w:ascii="Consolas" w:hAnsi="Consolas"/>
-          <w:sz w:val="19"/>
-        </w:rPr>
-        <w:t>requestAnimationFrame</w:t>
-      </w:r>
-      <w:r>
-        <w:t xml:space="preserve">, often about 60 times a second (lines 561–574). It calls </w:t>
-      </w:r>
-      <w:r>
-        <w:rPr>
-          <w:rFonts w:ascii="Consolas" w:hAnsi="Consolas"/>
-          <w:sz w:val="19"/>
-        </w:rPr>
-        <w:t>update(dt)</w:t>
-      </w:r>
-      <w:r>
-        <w:t xml:space="preserve"> to move things and check rules, then </w:t>
-      </w:r>
-      <w:r>
-        <w:rPr>
-          <w:rFonts w:ascii="Consolas" w:hAnsi="Consolas"/>
-          <w:sz w:val="19"/>
-        </w:rPr>
-        <w:t>draw()</w:t>
-      </w:r>
-      <w:r>
-        <w:t xml:space="preserve"> to draw the frame. </w:t>
-      </w:r>
-      <w:r>
-        <w:rPr>
-          <w:rFonts w:ascii="Consolas" w:hAnsi="Consolas"/>
-          <w:sz w:val="19"/>
-        </w:rPr>
-        <w:t>dt</w:t>
-      </w:r>
-      <w:r>
-        <w:t xml:space="preserve"> adjusts for time between frames.</w:t>
-      </w:r>
-    </w:p>
-    <w:p>
-      <w:pPr>
-        <w:pStyle w:val="Heading2"/>
-      </w:pPr>
-      <w:r>
-        <w:t>Input handling</w:t>
+        <w:t>The canvas is where the game is drawn. The game loop keeps moving the player, checking for hits, and drawing the next picture. Variables remember the level, attempts, and whether an extra jump is available.</w:t>
       </w:r>
     </w:p>
     <w:p>
       <w:r>
-        <w:t xml:space="preserve">Space, Up, W, clicking, or tapping jumps. The listeners change </w:t>
-      </w:r>
-      <w:r>
-        <w:rPr>
-          <w:rFonts w:ascii="Consolas" w:hAnsi="Consolas"/>
-          <w:sz w:val="19"/>
-        </w:rPr>
-        <w:t>jumpHeld</w:t>
-      </w:r>
-      <w:r>
-        <w:t xml:space="preserve"> and </w:t>
-      </w:r>
-      <w:r>
-        <w:rPr>
-          <w:rFonts w:ascii="Consolas" w:hAnsi="Consolas"/>
-          <w:sz w:val="19"/>
-        </w:rPr>
-        <w:t>jumpQueued</w:t>
-      </w:r>
-      <w:r>
-        <w:t xml:space="preserve">; </w:t>
-      </w:r>
-      <w:r>
-        <w:rPr>
-          <w:rFonts w:ascii="Consolas" w:hAnsi="Consolas"/>
-          <w:sz w:val="19"/>
-        </w:rPr>
-        <w:t>update()</w:t>
-      </w:r>
-      <w:r>
-        <w:t xml:space="preserve"> changes </w:t>
-      </w:r>
-      <w:r>
-        <w:rPr>
-          <w:rFonts w:ascii="Consolas" w:hAnsi="Consolas"/>
-          <w:sz w:val="19"/>
-        </w:rPr>
-        <w:t>player.vy</w:t>
-      </w:r>
-      <w:r>
-        <w:t>. A new press in the air uses the extra jump (lines 230–243).</w:t>
-      </w:r>
-    </w:p>
-    <w:p>
-      <w:pPr>
-        <w:pStyle w:val="Heading2"/>
-      </w:pPr>
-      <w:r>
-        <w:t>Collision and win or lose logic</w:t>
-      </w:r>
-    </w:p>
-    <w:p>
-      <w:r/>
-      <w:r>
-        <w:rPr>
-          <w:rFonts w:ascii="Consolas" w:hAnsi="Consolas"/>
-          <w:sz w:val="19"/>
-        </w:rPr>
-        <w:t>rectsOverlap(a,b)</w:t>
-      </w:r>
-      <w:r>
-        <w:t xml:space="preserve"> checks hitboxes (line 258):</w:t>
-      </w:r>
-    </w:p>
-    <w:p>
-      <w:pPr>
-        <w:pStyle w:val="Codeexcerpt"/>
-      </w:pPr>
-      <w:r>
-        <w:t>a.x &lt; b.x+b.w &amp;&amp; a.x+a.w &gt; b.x &amp;&amp;</w:t>
-        <w:br/>
-        <w:t>a.y &lt; b.y+b.h &amp;&amp; a.y+a.h &gt; b.y</w:t>
-      </w:r>
-    </w:p>
-    <w:p>
-      <w:r>
-        <w:t xml:space="preserve">Spikes call </w:t>
-      </w:r>
-      <w:r>
-        <w:rPr>
-          <w:rFonts w:ascii="Consolas" w:hAnsi="Consolas"/>
-          <w:sz w:val="19"/>
-        </w:rPr>
-        <w:t>die()</w:t>
-      </w:r>
-      <w:r>
-        <w:t xml:space="preserve">. Safe landings check </w:t>
-      </w:r>
-      <w:r>
-        <w:rPr>
-          <w:rFonts w:ascii="Consolas" w:hAnsi="Consolas"/>
-          <w:sz w:val="19"/>
-        </w:rPr>
-        <w:t>player.vy &gt;= 0 &amp;&amp; prevBottom &lt;= oy + 14</w:t>
-      </w:r>
-      <w:r>
-        <w:t xml:space="preserve"> (lines 364–371). Crashes restart the level. Portals lead to the next level; finishing all five shows YOU WIN!</w:t>
-      </w:r>
-    </w:p>
-    <w:p>
-      <w:pPr>
-        <w:pStyle w:val="Heading2"/>
-      </w:pPr>
-      <w:r>
-        <w:t>Scoring and progress</w:t>
-      </w:r>
-    </w:p>
-    <w:p>
-      <w:r>
-        <w:t xml:space="preserve">There are no points. </w:t>
-      </w:r>
-      <w:r>
-        <w:rPr>
-          <w:rFonts w:ascii="Consolas" w:hAnsi="Consolas"/>
-          <w:sz w:val="19"/>
-        </w:rPr>
-        <w:t>attempts++</w:t>
-      </w:r>
-      <w:r>
-        <w:t xml:space="preserve"> counts crashes (line 262). </w:t>
-      </w:r>
-      <w:r>
-        <w:rPr>
-          <w:rFonts w:ascii="Consolas" w:hAnsi="Consolas"/>
-          <w:sz w:val="19"/>
-        </w:rPr>
-        <w:t>player.x / levelEndX()</w:t>
-      </w:r>
-      <w:r>
-        <w:t xml:space="preserve"> fills the progress bar (lines 380–381). A recorded test reached Level 2 and confirmed that a spike added an attempt.</w:t>
-      </w:r>
-    </w:p>
-    <w:p>
-      <w:pPr>
-        <w:pStyle w:val="Caption"/>
-      </w:pPr>
-      <w:r>
-        <w:t>Line numbers refer to the linked five-level source file.</w:t>
+        <w:t>The game checks invisible hitboxes to decide when the player hits a spike or block. Landing on top of a block is safe, but hitting its side causes a crash. The attempt counter tracks crashes, and the progress bar shows how close the player is to the portal.</w:t>
       </w:r>
     </w:p>
     <w:p>
@@ -678,7 +408,7 @@
         <w:t>By October 16:</w:t>
       </w:r>
       <w:r>
-        <w:t xml:space="preserve"> Test double jumping ten times. Check that a third jump fails and landing restores the extra jump.</w:t>
+        <w:t xml:space="preserve"> Test that a third jump fails, and landing restores the extra jump.</w:t>
       </w:r>
     </w:p>
     <w:p>
@@ -710,7 +440,7 @@
         <w:t>By October 18:</w:t>
       </w:r>
       <w:r>
-        <w:t xml:space="preserve"> Test the later tutorial, all three languages, and saved progress after reloading.</w:t>
+        <w:t xml:space="preserve"> Refine the tutorials that I already have and improve upon them further. </w:t>
       </w:r>
     </w:p>
     <w:p>
@@ -731,19 +461,7 @@
     </w:p>
     <w:p>
       <w:r>
-        <w:t>I used WebGPT for the game code and Codex to help edit this journal.</w:t>
-      </w:r>
-    </w:p>
-    <w:p>
-      <w:r/>
-      <w:r>
-        <w:rPr>
-          <w:b/>
-        </w:rPr>
-        <w:t>Journal credit:</w:t>
-      </w:r>
-      <w:r>
-        <w:t xml:space="preserve"> ChatGPT helped me with the format and theme of this journal.</w:t>
+        <w:t>ChatGPT helped me with the format and theme of this journal.</w:t>
       </w:r>
     </w:p>
     <w:sectPr>

</xml_diff>

<commit_message>
Explain web language connections and jump logic with real game code
</commit_message>
<xml_diff>
--- a/assets/neon-dash/neon-dash-development-journal.docx
+++ b/assets/neon-dash/neon-dash-development-journal.docx
@@ -177,7 +177,228 @@
     </w:p>
     <w:p>
       <w:pPr>
+        <w:pStyle w:val="Heading2"/>
+      </w:pPr>
+      <w:r>
+        <w:t>Connecting HTML CSS and JavaScript</w:t>
+      </w:r>
+    </w:p>
+    <w:p>
+      <w:r>
+        <w:t xml:space="preserve">Looking at my actual game helped me understand how the three languages connect. In the first examples below, HTML creates the canvas and gives it the ID </w:t>
+      </w:r>
+      <w:r>
+        <w:rPr>
+          <w:rFonts w:ascii="Consolas" w:hAnsi="Consolas"/>
+          <w:sz w:val="19"/>
+        </w:rPr>
+        <w:t>game</w:t>
+      </w:r>
+      <w:r>
+        <w:t xml:space="preserve">. CSS makes the canvas fill the screen. JavaScript uses </w:t>
+      </w:r>
+      <w:r>
+        <w:rPr>
+          <w:rFonts w:ascii="Consolas" w:hAnsi="Consolas"/>
+          <w:sz w:val="19"/>
+        </w:rPr>
+        <w:t>document.getElementById('game')</w:t>
+      </w:r>
+      <w:r>
+        <w:t xml:space="preserve"> to find that same element, then </w:t>
+      </w:r>
+      <w:r>
+        <w:rPr>
+          <w:rFonts w:ascii="Consolas" w:hAnsi="Consolas"/>
+          <w:sz w:val="19"/>
+        </w:rPr>
+        <w:t>getContext('2d')</w:t>
+      </w:r>
+      <w:r>
+        <w:t xml:space="preserve"> gets the tools for drawing the player and obstacles. I learned that the ID connects the HTML element to the JavaScript code. The </w:t>
+      </w:r>
+      <w:r>
+        <w:rPr>
+          <w:rFonts w:ascii="Consolas" w:hAnsi="Consolas"/>
+          <w:sz w:val="19"/>
+        </w:rPr>
+        <w:t>&lt;style&gt;</w:t>
+      </w:r>
+      <w:r>
+        <w:t xml:space="preserve"> section is where I would change the layout, while the </w:t>
+      </w:r>
+      <w:r>
+        <w:rPr>
+          <w:rFonts w:ascii="Consolas" w:hAnsi="Consolas"/>
+          <w:sz w:val="19"/>
+        </w:rPr>
+        <w:t>&lt;script&gt;</w:t>
+      </w:r>
+      <w:r>
+        <w:t xml:space="preserve"> section controls the game.</w:t>
+      </w:r>
+    </w:p>
+    <w:p>
+      <w:pPr>
+        <w:pStyle w:val="Codeexcerpt"/>
+      </w:pPr>
+      <w:r>
+        <w:t>&lt;canvas id="game"&gt;&lt;/canvas&gt;</w:t>
+      </w:r>
+    </w:p>
+    <w:p>
+      <w:pPr>
+        <w:pStyle w:val="Codeexcerpt"/>
+      </w:pPr>
+      <w:r>
+        <w:t>canvas { display:block; position:fixed; inset:0; width:100%; height:100%; }</w:t>
+      </w:r>
+    </w:p>
+    <w:p>
+      <w:pPr>
+        <w:pStyle w:val="Codeexcerpt"/>
+      </w:pPr>
+      <w:r>
+        <w:t>const canvas = document.getElementById('game');</w:t>
+        <w:br/>
+        <w:t>const ctx = canvas.getContext('2d');</w:t>
+      </w:r>
+    </w:p>
+    <w:p>
+      <w:pPr>
+        <w:pStyle w:val="Heading2"/>
+      </w:pPr>
+      <w:r>
+        <w:t>Understanding the jump code</w:t>
+      </w:r>
+    </w:p>
+    <w:p>
+      <w:r>
+        <w:t xml:space="preserve">The jump code helped me understand variables and conditions. </w:t>
+      </w:r>
+      <w:r>
+        <w:rPr>
+          <w:rFonts w:ascii="Consolas" w:hAnsi="Consolas"/>
+          <w:sz w:val="19"/>
+        </w:rPr>
+        <w:t>player.onGround</w:t>
+      </w:r>
+      <w:r>
+        <w:t xml:space="preserve"> separates ground jumps from jumps in the air. The </w:t>
+      </w:r>
+      <w:r>
+        <w:rPr>
+          <w:rFonts w:ascii="Consolas" w:hAnsi="Consolas"/>
+          <w:sz w:val="19"/>
+        </w:rPr>
+        <w:t>&amp;&amp;</w:t>
+      </w:r>
+      <w:r>
+        <w:t xml:space="preserve"> means both checks must be true: there must be a new button press, and </w:t>
+      </w:r>
+      <w:r>
+        <w:rPr>
+          <w:rFonts w:ascii="Consolas" w:hAnsi="Consolas"/>
+          <w:sz w:val="19"/>
+        </w:rPr>
+        <w:t>player.airJumps</w:t>
+      </w:r>
+      <w:r>
+        <w:t xml:space="preserve"> must be above zero. </w:t>
+      </w:r>
+      <w:r>
+        <w:rPr>
+          <w:rFonts w:ascii="Consolas" w:hAnsi="Consolas"/>
+          <w:sz w:val="19"/>
+        </w:rPr>
+        <w:t>player.vy = DJUMP_V</w:t>
+      </w:r>
+      <w:r>
+        <w:t xml:space="preserve"> makes the player rise because </w:t>
+      </w:r>
+      <w:r>
+        <w:rPr>
+          <w:rFonts w:ascii="Consolas" w:hAnsi="Consolas"/>
+          <w:sz w:val="19"/>
+        </w:rPr>
+        <w:t>DJUMP_V</w:t>
+      </w:r>
+      <w:r>
+        <w:t xml:space="preserve"> is </w:t>
+      </w:r>
+      <w:r>
+        <w:rPr>
+          <w:rFonts w:ascii="Consolas" w:hAnsi="Consolas"/>
+          <w:sz w:val="19"/>
+        </w:rPr>
+        <w:t>-12.2</w:t>
+      </w:r>
+      <w:r>
+        <w:t xml:space="preserve">. The </w:t>
+      </w:r>
+      <w:r>
+        <w:rPr>
+          <w:rFonts w:ascii="Consolas" w:hAnsi="Consolas"/>
+          <w:sz w:val="19"/>
+        </w:rPr>
+        <w:t>--</w:t>
+      </w:r>
+      <w:r>
+        <w:t xml:space="preserve"> uses up one extra jump, and </w:t>
+      </w:r>
+      <w:r>
+        <w:rPr>
+          <w:rFonts w:ascii="Consolas" w:hAnsi="Consolas"/>
+          <w:sz w:val="19"/>
+        </w:rPr>
+        <w:t>jumpQueued = false</w:t>
+      </w:r>
+      <w:r>
+        <w:t xml:space="preserve"> clears that press so it cannot count twice. Landing runs </w:t>
+      </w:r>
+      <w:r>
+        <w:rPr>
+          <w:rFonts w:ascii="Consolas" w:hAnsi="Consolas"/>
+          <w:sz w:val="19"/>
+        </w:rPr>
+        <w:t>player.airJumps = 1</w:t>
+      </w:r>
+      <w:r>
+        <w:t xml:space="preserve"> to restore the extra jump. Now I can ask AI to change a specific jump setting or rule and understand which part of the code should change.</w:t>
+      </w:r>
+    </w:p>
+    <w:p>
+      <w:pPr>
+        <w:pStyle w:val="Codeexcerpt"/>
+      </w:pPr>
+      <w:r>
+        <w:t>if(player.onGround){</w:t>
+        <w:br/>
+        <w:t xml:space="preserve">  if(jumpHeld){</w:t>
+        <w:br/>
+        <w:t xml:space="preserve">    player.vy = JUMP_V; player.onGround = false;</w:t>
+        <w:br/>
+        <w:t xml:space="preserve">    jumpQueued = false;</w:t>
+        <w:br/>
+        <w:t xml:space="preserve">  }</w:t>
+        <w:br/>
+        <w:t>} else if(jumpQueued &amp;&amp; player.airJumps &gt; 0){</w:t>
+        <w:br/>
+        <w:t xml:space="preserve">  player.vy = DJUMP_V;</w:t>
+        <w:br/>
+        <w:t xml:space="preserve">  player.airJumps--;</w:t>
+        <w:br/>
+        <w:t xml:space="preserve">  jumpQueued = false;</w:t>
+        <w:br/>
+        <w:t xml:space="preserve">  doubleJumpFX();</w:t>
+        <w:br/>
+        <w:t>}</w:t>
+      </w:r>
+    </w:p>
+    <w:p>
+      <w:pPr>
         <w:pStyle w:val="Heading1"/>
+        <w:pageBreakBefore/>
       </w:pPr>
       <w:r>
         <w:t>How I would build software next time</w:t>
@@ -209,7 +430,6 @@
     <w:p>
       <w:pPr>
         <w:pStyle w:val="Heading1"/>
-        <w:pageBreakBefore/>
       </w:pPr>
       <w:r>
         <w:t>Screenshots and goals</w:t>

</xml_diff>